<commit_message>
udate hr round answers
</commit_message>
<xml_diff>
--- a/hr arround.docx
+++ b/hr arround.docx
@@ -101,19 +101,17 @@
           <w:szCs w:val="24"/>
           <w:lang w:eastAsia="en-IN"/>
         </w:rPr>
-        <w:t>Hi, I'm Ankit Kumar. I have around 5 years and 3 months of experience as a Software Engineer.</w:t>
-      </w:r>
-    </w:p>
-    <w:p>
-      <w:pPr>
-        <w:pStyle w:val="ListParagraph"/>
+        <w:t>Hi, I'm Ankit Ku</w:t>
+      </w:r>
+      <w:r>
         <w:rPr>
           <w:rFonts w:ascii="Times New Roman" w:eastAsia="Times New Roman" w:hAnsi="Times New Roman" w:cs="Times New Roman"/>
           <w:sz w:val="24"/>
           <w:szCs w:val="24"/>
           <w:lang w:eastAsia="en-IN"/>
         </w:rPr>
-      </w:pPr>
+        <w:t xml:space="preserve">mar. I have around 5 years and </w:t>
+      </w:r>
       <w:r>
         <w:rPr>
           <w:rFonts w:ascii="Times New Roman" w:eastAsia="Times New Roman" w:hAnsi="Times New Roman" w:cs="Times New Roman"/>
@@ -121,39 +119,37 @@
           <w:szCs w:val="24"/>
           <w:lang w:eastAsia="en-IN"/>
         </w:rPr>
-        <w:t>Currently, I am working on large-scale web applications where I contribute across both frontend and backend development. My primary skills are React.js, Next.js, Node.js, Nest.js, JavaScript, and TypeScript.</w:t>
-      </w:r>
-    </w:p>
-    <w:p>
-      <w:pPr>
-        <w:pStyle w:val="ListParagraph"/>
+        <w:t>6</w:t>
+      </w:r>
+      <w:r>
         <w:rPr>
           <w:rFonts w:ascii="Times New Roman" w:eastAsia="Times New Roman" w:hAnsi="Times New Roman" w:cs="Times New Roman"/>
           <w:sz w:val="24"/>
           <w:szCs w:val="24"/>
           <w:lang w:eastAsia="en-IN"/>
         </w:rPr>
-      </w:pPr>
-      <w:r>
+        <w:t xml:space="preserve"> months of experience as a Software Engineer.</w:t>
+      </w:r>
+    </w:p>
+    <w:p>
+      <w:pPr>
+        <w:pStyle w:val="ListParagraph"/>
         <w:rPr>
           <w:rFonts w:ascii="Times New Roman" w:eastAsia="Times New Roman" w:hAnsi="Times New Roman" w:cs="Times New Roman"/>
           <w:sz w:val="24"/>
           <w:szCs w:val="24"/>
           <w:lang w:eastAsia="en-IN"/>
         </w:rPr>
-        <w:t>Over the years, I have worked on multiple products involving job marketplaces, healthcare platforms, AI-powered matching systems, payment integrations, analytics dashboards, and cloud-based solutions on AWS.</w:t>
-      </w:r>
-    </w:p>
-    <w:p>
-      <w:pPr>
-        <w:pStyle w:val="ListParagraph"/>
+      </w:pPr>
+      <w:r>
         <w:rPr>
           <w:rFonts w:ascii="Times New Roman" w:eastAsia="Times New Roman" w:hAnsi="Times New Roman" w:cs="Times New Roman"/>
           <w:sz w:val="24"/>
           <w:szCs w:val="24"/>
           <w:lang w:eastAsia="en-IN"/>
         </w:rPr>
-      </w:pPr>
+        <w:t xml:space="preserve">Currently, I am working </w:t>
+      </w:r>
       <w:r>
         <w:rPr>
           <w:rFonts w:ascii="Times New Roman" w:eastAsia="Times New Roman" w:hAnsi="Times New Roman" w:cs="Times New Roman"/>
@@ -161,18 +157,67 @@
           <w:szCs w:val="24"/>
           <w:lang w:eastAsia="en-IN"/>
         </w:rPr>
-        <w:t>Apart from development, I enjoy solving business problems, collaborating with cross-functional teams, and continuously learning new technologies. I'm currently looking for opportunities where I can take ownership of complex systems and contribute to scalable product development.</w:t>
-      </w:r>
-    </w:p>
-    <w:p>
-      <w:pPr>
-        <w:pStyle w:val="ListParagraph"/>
+        <w:t>on</w:t>
+      </w:r>
+      <w:r>
         <w:rPr>
           <w:rFonts w:ascii="Times New Roman" w:eastAsia="Times New Roman" w:hAnsi="Times New Roman" w:cs="Times New Roman"/>
           <w:sz w:val="24"/>
           <w:szCs w:val="24"/>
           <w:lang w:eastAsia="en-IN"/>
         </w:rPr>
+        <w:t xml:space="preserve"> web applications where I contribute across both frontend and backend development. My primary skills are React.js, Next.js, Node.js, Nest.js, JavaScript, and TypeScript.</w:t>
+      </w:r>
+    </w:p>
+    <w:p>
+      <w:pPr>
+        <w:pStyle w:val="ListParagraph"/>
+        <w:rPr>
+          <w:rFonts w:ascii="Times New Roman" w:eastAsia="Times New Roman" w:hAnsi="Times New Roman" w:cs="Times New Roman"/>
+          <w:sz w:val="24"/>
+          <w:szCs w:val="24"/>
+          <w:lang w:eastAsia="en-IN"/>
+        </w:rPr>
+      </w:pPr>
+      <w:r>
+        <w:rPr>
+          <w:rFonts w:ascii="Times New Roman" w:eastAsia="Times New Roman" w:hAnsi="Times New Roman" w:cs="Times New Roman"/>
+          <w:sz w:val="24"/>
+          <w:szCs w:val="24"/>
+          <w:lang w:eastAsia="en-IN"/>
+        </w:rPr>
+        <w:t>Over the years, I have worked on multiple products involving job marketplaces, healthcare platforms, AI-powered matching systems, payment integrations, analytics dashboards, and cloud-based solutions on AWS.</w:t>
+      </w:r>
+    </w:p>
+    <w:p>
+      <w:pPr>
+        <w:pStyle w:val="ListParagraph"/>
+        <w:rPr>
+          <w:rFonts w:ascii="Times New Roman" w:eastAsia="Times New Roman" w:hAnsi="Times New Roman" w:cs="Times New Roman"/>
+          <w:sz w:val="24"/>
+          <w:szCs w:val="24"/>
+          <w:lang w:eastAsia="en-IN"/>
+        </w:rPr>
+      </w:pPr>
+      <w:r>
+        <w:rPr>
+          <w:rFonts w:ascii="Times New Roman" w:eastAsia="Times New Roman" w:hAnsi="Times New Roman" w:cs="Times New Roman"/>
+          <w:sz w:val="24"/>
+          <w:szCs w:val="24"/>
+          <w:lang w:eastAsia="en-IN"/>
+        </w:rPr>
+        <w:t>Apart from development, I enjoy solving business problems, collaborating with cross-functional teams, and continuously learning new technologies. I'm currently looking for opportunities where I can take ownership of complex systems and contribute to scalable product development.</w:t>
+      </w:r>
+    </w:p>
+    <w:p>
+      <w:pPr>
+        <w:pStyle w:val="ListParagraph"/>
+        <w:rPr>
+          <w:rFonts w:ascii="Times New Roman" w:eastAsia="Times New Roman" w:hAnsi="Times New Roman" w:cs="Times New Roman"/>
+          <w:sz w:val="24"/>
+          <w:szCs w:val="24"/>
+          <w:lang w:eastAsia="en-IN"/>
+        </w:rPr>
       </w:pPr>
     </w:p>
     <w:p>
@@ -214,30 +259,26 @@
           <w:szCs w:val="24"/>
           <w:lang w:eastAsia="en-IN"/>
         </w:rPr>
-        <w:t>Hi, I'm Ankit Kumar. I have 5 years and 3 months of experience as a Full Stack Software Engineer.</w:t>
-      </w:r>
-    </w:p>
-    <w:p>
-      <w:pPr>
-        <w:pStyle w:val="ListParagraph"/>
+        <w:t>Hi, I'm A</w:t>
+      </w:r>
+      <w:r>
         <w:rPr>
           <w:rFonts w:ascii="Times New Roman" w:eastAsia="Times New Roman" w:hAnsi="Times New Roman" w:cs="Times New Roman"/>
           <w:sz w:val="24"/>
           <w:szCs w:val="24"/>
           <w:lang w:eastAsia="en-IN"/>
         </w:rPr>
-      </w:pPr>
-    </w:p>
-    <w:p>
-      <w:pPr>
-        <w:pStyle w:val="ListParagraph"/>
+        <w:t xml:space="preserve">nkit Kumar. I have 5 years and </w:t>
+      </w:r>
+      <w:r>
         <w:rPr>
           <w:rFonts w:ascii="Times New Roman" w:eastAsia="Times New Roman" w:hAnsi="Times New Roman" w:cs="Times New Roman"/>
           <w:sz w:val="24"/>
           <w:szCs w:val="24"/>
           <w:lang w:eastAsia="en-IN"/>
         </w:rPr>
-      </w:pPr>
+        <w:t>6</w:t>
+      </w:r>
       <w:r>
         <w:rPr>
           <w:rFonts w:ascii="Times New Roman" w:eastAsia="Times New Roman" w:hAnsi="Times New Roman" w:cs="Times New Roman"/>
@@ -245,7 +286,7 @@
           <w:szCs w:val="24"/>
           <w:lang w:eastAsia="en-IN"/>
         </w:rPr>
-        <w:t>My core expertise is in JavaScript, TypeScript, React.js, Next.js, Node.js, and Nest.js. In my current role, I work on both frontend and backend systems, with roughly 70% frontend and 30% backend responsibilities.</w:t>
+        <w:t xml:space="preserve"> months of experience as a Full Stack Software Engineer.</w:t>
       </w:r>
     </w:p>
     <w:p>
@@ -276,10 +317,39 @@
           <w:szCs w:val="24"/>
           <w:lang w:eastAsia="en-IN"/>
         </w:rPr>
+        <w:t>My core expertise is in JavaScript, TypeScript, React.js, Next.js, Node.js, and Nest.js. In my current role, I work on both frontend and backend systems, with roughly 70% frontend and 30% backend responsibilities.</w:t>
+      </w:r>
+    </w:p>
+    <w:p>
+      <w:pPr>
+        <w:pStyle w:val="ListParagraph"/>
+        <w:rPr>
+          <w:rFonts w:ascii="Times New Roman" w:eastAsia="Times New Roman" w:hAnsi="Times New Roman" w:cs="Times New Roman"/>
+          <w:sz w:val="24"/>
+          <w:szCs w:val="24"/>
+          <w:lang w:eastAsia="en-IN"/>
+        </w:rPr>
+      </w:pPr>
+    </w:p>
+    <w:p>
+      <w:pPr>
+        <w:pStyle w:val="ListParagraph"/>
+        <w:rPr>
+          <w:rFonts w:ascii="Times New Roman" w:eastAsia="Times New Roman" w:hAnsi="Times New Roman" w:cs="Times New Roman"/>
+          <w:sz w:val="24"/>
+          <w:szCs w:val="24"/>
+          <w:lang w:eastAsia="en-IN"/>
+        </w:rPr>
+      </w:pPr>
+      <w:r>
+        <w:rPr>
+          <w:rFonts w:ascii="Times New Roman" w:eastAsia="Times New Roman" w:hAnsi="Times New Roman" w:cs="Times New Roman"/>
+          <w:sz w:val="24"/>
+          <w:szCs w:val="24"/>
+          <w:lang w:eastAsia="en-IN"/>
+        </w:rPr>
         <w:t>Recently, I have worked on projects involving payment integrations, role-based access control, GraphQL and REST APIs, analytics dashboards, recruiter and employer workflows, and AWS-based services.</w:t>
       </w:r>
-      <w:bookmarkStart w:id="0" w:name="_GoBack"/>
-      <w:bookmarkEnd w:id="0"/>
     </w:p>
     <w:p>
       <w:pPr>
@@ -626,42 +696,31 @@
       <w:pPr>
         <w:pStyle w:val="ListParagraph"/>
         <w:rPr>
+          <w:rFonts w:ascii="Times New Roman" w:eastAsia="Times New Roman" w:hAnsi="Times New Roman" w:cs="Times New Roman"/>
+          <w:sz w:val="26"/>
+          <w:szCs w:val="26"/>
+          <w:lang w:eastAsia="en-IN"/>
+        </w:rPr>
+      </w:pPr>
+      <w:r>
+        <w:rPr>
+          <w:rFonts w:ascii="Times New Roman" w:eastAsia="Times New Roman" w:hAnsi="Times New Roman" w:cs="Times New Roman"/>
+          <w:sz w:val="26"/>
+          <w:szCs w:val="26"/>
+          <w:lang w:eastAsia="en-IN"/>
+        </w:rPr>
+        <w:t>I’m not looking for a change because of a lack of exposure. Instead, I’m looking for an environment where I can contribute at a larger scale, work on more complex engineering challenges, and continue growing as a senior engineer while taking greater ownership of technical decisions.</w:t>
+      </w:r>
+    </w:p>
+    <w:p>
+      <w:pPr>
+        <w:pStyle w:val="ListParagraph"/>
+        <w:rPr>
           <w:rFonts w:ascii="Times New Roman" w:hAnsi="Times New Roman" w:cs="Times New Roman"/>
           <w:b/>
           <w:bCs/>
           <w:sz w:val="26"/>
           <w:szCs w:val="26"/>
-        </w:rPr>
-      </w:pPr>
-      <w:r>
-        <w:rPr>
-          <w:rFonts w:ascii="Times New Roman" w:eastAsia="Times New Roman" w:hAnsi="Times New Roman" w:cs="Times New Roman"/>
-          <w:sz w:val="26"/>
-          <w:szCs w:val="26"/>
-          <w:lang w:eastAsia="en-IN"/>
-        </w:rPr>
-        <w:t>I’m not looking for a change because of a lack of exposure. Instead, I’m looking for an environment where I can contribute at a larger scale, work on more complex engineering challenges, and continue growing as a senior engineer while taking greater ownership of technical decisions.</w:t>
-      </w:r>
-    </w:p>
-    <w:p>
-      <w:pPr>
-        <w:pStyle w:val="ListParagraph"/>
-        <w:rPr>
-          <w:rStyle w:val="Strong"/>
-          <w:rFonts w:ascii="Times New Roman" w:hAnsi="Times New Roman" w:cs="Times New Roman"/>
-          <w:sz w:val="26"/>
-          <w:szCs w:val="26"/>
-        </w:rPr>
-      </w:pPr>
-    </w:p>
-    <w:p>
-      <w:pPr>
-        <w:pStyle w:val="ListParagraph"/>
-        <w:rPr>
-          <w:rFonts w:ascii="Times New Roman" w:hAnsi="Times New Roman" w:cs="Times New Roman"/>
-          <w:sz w:val="26"/>
-          <w:szCs w:val="26"/>
-          <w:lang w:val="en-US"/>
         </w:rPr>
       </w:pPr>
     </w:p>
@@ -687,72 +746,70 @@
           <w:sz w:val="32"/>
           <w:szCs w:val="32"/>
         </w:rPr>
-        <w:t>What are your strengths?</w:t>
-      </w:r>
-    </w:p>
-    <w:p>
-      <w:pPr>
-        <w:pStyle w:val="ListParagraph"/>
-        <w:rPr>
-          <w:rFonts w:ascii="Times New Roman" w:hAnsi="Times New Roman" w:cs="Times New Roman"/>
-          <w:b/>
-          <w:sz w:val="26"/>
-          <w:szCs w:val="26"/>
-          <w:lang w:val="en-US"/>
-        </w:rPr>
-      </w:pPr>
-      <w:r>
-        <w:rPr>
-          <w:rFonts w:ascii="Times New Roman" w:hAnsi="Times New Roman" w:cs="Times New Roman"/>
-          <w:b/>
-          <w:sz w:val="26"/>
-          <w:szCs w:val="26"/>
-        </w:rPr>
-        <w:t>HR Round</w:t>
-      </w:r>
-    </w:p>
-    <w:p>
-      <w:pPr>
-        <w:pStyle w:val="ListParagraph"/>
-        <w:rPr>
-          <w:rFonts w:ascii="Times New Roman" w:hAnsi="Times New Roman" w:cs="Times New Roman"/>
-          <w:sz w:val="26"/>
-          <w:szCs w:val="26"/>
-        </w:rPr>
-      </w:pPr>
-      <w:r>
-        <w:rPr>
-          <w:rFonts w:ascii="Times New Roman" w:hAnsi="Times New Roman" w:cs="Times New Roman"/>
-          <w:sz w:val="26"/>
-          <w:szCs w:val="26"/>
-        </w:rPr>
-        <w:t xml:space="preserve">My key strengths include strong expertise in </w:t>
-      </w:r>
-      <w:r>
-        <w:rPr>
-          <w:rStyle w:val="Strong"/>
-          <w:rFonts w:ascii="Times New Roman" w:hAnsi="Times New Roman" w:cs="Times New Roman"/>
-          <w:sz w:val="26"/>
-          <w:szCs w:val="26"/>
-        </w:rPr>
-        <w:t>React.js and Next.js</w:t>
-      </w:r>
-      <w:r>
-        <w:rPr>
-          <w:rFonts w:ascii="Times New Roman" w:hAnsi="Times New Roman" w:cs="Times New Roman"/>
-          <w:sz w:val="26"/>
-          <w:szCs w:val="26"/>
-        </w:rPr>
-        <w:t xml:space="preserve">, along with a solid understanding of </w:t>
-      </w:r>
-      <w:r>
-        <w:rPr>
-          <w:rStyle w:val="Strong"/>
-          <w:rFonts w:ascii="Times New Roman" w:hAnsi="Times New Roman" w:cs="Times New Roman"/>
-          <w:sz w:val="26"/>
-          <w:szCs w:val="26"/>
-        </w:rPr>
-        <w:t>full-stack development</w:t>
+        <w:t>What is your current CTC and expected CTC?</w:t>
+      </w:r>
+    </w:p>
+    <w:p>
+      <w:pPr>
+        <w:pStyle w:val="ListParagraph"/>
+        <w:rPr>
+          <w:rFonts w:ascii="Times New Roman" w:hAnsi="Times New Roman" w:cs="Times New Roman"/>
+          <w:b/>
+          <w:bCs/>
+          <w:sz w:val="26"/>
+          <w:szCs w:val="26"/>
+        </w:rPr>
+      </w:pPr>
+      <w:r>
+        <w:rPr>
+          <w:rFonts w:ascii="Times New Roman" w:hAnsi="Times New Roman" w:cs="Times New Roman"/>
+          <w:sz w:val="26"/>
+          <w:szCs w:val="26"/>
+        </w:rPr>
+        <w:t xml:space="preserve">My current CTC is </w:t>
+      </w:r>
+      <w:r>
+        <w:rPr>
+          <w:rStyle w:val="Strong"/>
+          <w:rFonts w:ascii="Times New Roman" w:hAnsi="Times New Roman" w:cs="Times New Roman"/>
+          <w:sz w:val="26"/>
+          <w:szCs w:val="26"/>
+        </w:rPr>
+        <w:t>₹9 LPA</w:t>
+      </w:r>
+      <w:r>
+        <w:rPr>
+          <w:rFonts w:ascii="Times New Roman" w:hAnsi="Times New Roman" w:cs="Times New Roman"/>
+          <w:sz w:val="26"/>
+          <w:szCs w:val="26"/>
+        </w:rPr>
+        <w:t xml:space="preserve">. Based on my experience, skill set, and current market standards, I’m looking for a compensation in the range of </w:t>
+      </w:r>
+      <w:r>
+        <w:rPr>
+          <w:rStyle w:val="Strong"/>
+          <w:rFonts w:ascii="Times New Roman" w:hAnsi="Times New Roman" w:cs="Times New Roman"/>
+          <w:sz w:val="26"/>
+          <w:szCs w:val="26"/>
+        </w:rPr>
+        <w:t>₹14–15.5 LPA</w:t>
+      </w:r>
+      <w:r>
+        <w:rPr>
+          <w:rFonts w:ascii="Times New Roman" w:hAnsi="Times New Roman" w:cs="Times New Roman"/>
+          <w:sz w:val="26"/>
+          <w:szCs w:val="26"/>
+        </w:rPr>
+        <w:t xml:space="preserve">, which is roughly a </w:t>
+      </w:r>
+      <w:r>
+        <w:rPr>
+          <w:rStyle w:val="Strong"/>
+          <w:rFonts w:ascii="Times New Roman" w:hAnsi="Times New Roman" w:cs="Times New Roman"/>
+          <w:sz w:val="26"/>
+          <w:szCs w:val="26"/>
+        </w:rPr>
+        <w:t>60–70% hike</w:t>
       </w:r>
       <w:r>
         <w:rPr>
@@ -769,245 +826,26 @@
           <w:szCs w:val="26"/>
         </w:rPr>
         <w:br/>
-        <w:t xml:space="preserve">I have hands-on experience working on </w:t>
-      </w:r>
-      <w:r>
-        <w:rPr>
-          <w:rStyle w:val="Strong"/>
-          <w:rFonts w:ascii="Times New Roman" w:hAnsi="Times New Roman" w:cs="Times New Roman"/>
-          <w:sz w:val="26"/>
-          <w:szCs w:val="26"/>
-        </w:rPr>
-        <w:t>real-world production systems</w:t>
-      </w:r>
-      <w:r>
-        <w:rPr>
-          <w:rFonts w:ascii="Times New Roman" w:hAnsi="Times New Roman" w:cs="Times New Roman"/>
-          <w:sz w:val="26"/>
-          <w:szCs w:val="26"/>
-        </w:rPr>
-        <w:t>, which has helped me understand how technology aligns with business needs.</w:t>
-      </w:r>
-      <w:r>
-        <w:rPr>
-          <w:rFonts w:ascii="Times New Roman" w:hAnsi="Times New Roman" w:cs="Times New Roman"/>
-          <w:sz w:val="26"/>
-          <w:szCs w:val="26"/>
-        </w:rPr>
-        <w:br/>
-        <w:t xml:space="preserve">I’m good at </w:t>
-      </w:r>
-      <w:r>
-        <w:rPr>
-          <w:rStyle w:val="Strong"/>
-          <w:rFonts w:ascii="Times New Roman" w:hAnsi="Times New Roman" w:cs="Times New Roman"/>
-          <w:sz w:val="26"/>
-          <w:szCs w:val="26"/>
-        </w:rPr>
-        <w:t>problem-solving and debugging</w:t>
-      </w:r>
-      <w:r>
-        <w:rPr>
-          <w:rFonts w:ascii="Times New Roman" w:hAnsi="Times New Roman" w:cs="Times New Roman"/>
-          <w:sz w:val="26"/>
-          <w:szCs w:val="26"/>
-        </w:rPr>
-        <w:t xml:space="preserve">, and I can effectively convert </w:t>
-      </w:r>
-      <w:r>
-        <w:rPr>
-          <w:rStyle w:val="Strong"/>
-          <w:rFonts w:ascii="Times New Roman" w:hAnsi="Times New Roman" w:cs="Times New Roman"/>
-          <w:sz w:val="26"/>
-          <w:szCs w:val="26"/>
-        </w:rPr>
-        <w:t>business requirements into practical technical solutions</w:t>
-      </w:r>
-      <w:r>
-        <w:rPr>
-          <w:rFonts w:ascii="Times New Roman" w:hAnsi="Times New Roman" w:cs="Times New Roman"/>
-          <w:sz w:val="26"/>
-          <w:szCs w:val="26"/>
-        </w:rPr>
-        <w:t>.</w:t>
-      </w:r>
-      <w:r>
-        <w:rPr>
-          <w:rFonts w:ascii="Times New Roman" w:hAnsi="Times New Roman" w:cs="Times New Roman"/>
-          <w:sz w:val="26"/>
-          <w:szCs w:val="26"/>
-        </w:rPr>
-        <w:br/>
-        <w:t xml:space="preserve">Additionally, I’m a </w:t>
-      </w:r>
-      <w:r>
-        <w:rPr>
-          <w:rStyle w:val="Strong"/>
-          <w:rFonts w:ascii="Times New Roman" w:hAnsi="Times New Roman" w:cs="Times New Roman"/>
-          <w:sz w:val="26"/>
-          <w:szCs w:val="26"/>
-        </w:rPr>
-        <w:t>team player</w:t>
-      </w:r>
-      <w:r>
-        <w:rPr>
-          <w:rFonts w:ascii="Times New Roman" w:hAnsi="Times New Roman" w:cs="Times New Roman"/>
-          <w:sz w:val="26"/>
-          <w:szCs w:val="26"/>
-        </w:rPr>
-        <w:t xml:space="preserve"> who collaborates well with cross-functional teams to deliver results</w:t>
-      </w:r>
-    </w:p>
-    <w:p>
-      <w:pPr>
-        <w:pStyle w:val="ListParagraph"/>
-        <w:rPr>
-          <w:rFonts w:ascii="Times New Roman" w:hAnsi="Times New Roman" w:cs="Times New Roman"/>
-        </w:rPr>
-      </w:pPr>
-    </w:p>
-    <w:p>
-      <w:pPr>
-        <w:pStyle w:val="ListParagraph"/>
-        <w:rPr>
-          <w:rFonts w:ascii="Times New Roman" w:hAnsi="Times New Roman" w:cs="Times New Roman"/>
-          <w:b/>
-          <w:sz w:val="26"/>
-          <w:szCs w:val="26"/>
-        </w:rPr>
-      </w:pPr>
-      <w:r>
-        <w:rPr>
-          <w:rFonts w:ascii="Times New Roman" w:hAnsi="Times New Roman" w:cs="Times New Roman"/>
-          <w:b/>
-          <w:sz w:val="26"/>
-          <w:szCs w:val="26"/>
-        </w:rPr>
-        <w:t>Technical Round</w:t>
-      </w:r>
-    </w:p>
-    <w:p>
-      <w:pPr>
-        <w:pStyle w:val="ListParagraph"/>
-        <w:rPr>
-          <w:rFonts w:ascii="Times New Roman" w:hAnsi="Times New Roman" w:cs="Times New Roman"/>
-          <w:sz w:val="26"/>
-          <w:szCs w:val="26"/>
-        </w:rPr>
-      </w:pPr>
-      <w:r>
-        <w:rPr>
-          <w:rFonts w:ascii="Times New Roman" w:hAnsi="Times New Roman" w:cs="Times New Roman"/>
-          <w:sz w:val="26"/>
-          <w:szCs w:val="26"/>
-        </w:rPr>
-        <w:lastRenderedPageBreak/>
-        <w:t xml:space="preserve">My core strength is my </w:t>
-      </w:r>
-      <w:r>
-        <w:rPr>
-          <w:rStyle w:val="Strong"/>
-          <w:rFonts w:ascii="Times New Roman" w:hAnsi="Times New Roman" w:cs="Times New Roman"/>
-          <w:sz w:val="26"/>
-          <w:szCs w:val="26"/>
-        </w:rPr>
-        <w:t>deep hands-on experience with React.js and Next.js</w:t>
-      </w:r>
-      <w:r>
-        <w:rPr>
-          <w:rFonts w:ascii="Times New Roman" w:hAnsi="Times New Roman" w:cs="Times New Roman"/>
-          <w:sz w:val="26"/>
-          <w:szCs w:val="26"/>
-        </w:rPr>
-        <w:t>, including building scalable and performance-optimized applications.</w:t>
-      </w:r>
-      <w:r>
-        <w:rPr>
-          <w:rFonts w:ascii="Times New Roman" w:hAnsi="Times New Roman" w:cs="Times New Roman"/>
-          <w:sz w:val="26"/>
-          <w:szCs w:val="26"/>
-        </w:rPr>
-        <w:br/>
-        <w:t xml:space="preserve">I have a strong understanding of </w:t>
-      </w:r>
-      <w:r>
-        <w:rPr>
-          <w:rStyle w:val="Strong"/>
-          <w:rFonts w:ascii="Times New Roman" w:hAnsi="Times New Roman" w:cs="Times New Roman"/>
-          <w:sz w:val="26"/>
-          <w:szCs w:val="26"/>
-        </w:rPr>
-        <w:t>full-stack architecture</w:t>
-      </w:r>
-      <w:r>
-        <w:rPr>
-          <w:rFonts w:ascii="Times New Roman" w:hAnsi="Times New Roman" w:cs="Times New Roman"/>
-          <w:sz w:val="26"/>
-          <w:szCs w:val="26"/>
-        </w:rPr>
-        <w:t>, API integrations, and database interactions in production environments.</w:t>
-      </w:r>
-      <w:r>
-        <w:rPr>
-          <w:rFonts w:ascii="Times New Roman" w:hAnsi="Times New Roman" w:cs="Times New Roman"/>
-          <w:sz w:val="26"/>
-          <w:szCs w:val="26"/>
-        </w:rPr>
-        <w:br/>
-        <w:t xml:space="preserve">I’m comfortable working on </w:t>
-      </w:r>
-      <w:r>
-        <w:rPr>
-          <w:rStyle w:val="Strong"/>
-          <w:rFonts w:ascii="Times New Roman" w:hAnsi="Times New Roman" w:cs="Times New Roman"/>
-          <w:sz w:val="26"/>
-          <w:szCs w:val="26"/>
-        </w:rPr>
-        <w:t>live systems</w:t>
-      </w:r>
-      <w:r>
-        <w:rPr>
-          <w:rFonts w:ascii="Times New Roman" w:hAnsi="Times New Roman" w:cs="Times New Roman"/>
-          <w:sz w:val="26"/>
-          <w:szCs w:val="26"/>
-        </w:rPr>
-        <w:t>, debugging complex issues, and optimizing existing codebases.</w:t>
-      </w:r>
-      <w:r>
-        <w:rPr>
-          <w:rFonts w:ascii="Times New Roman" w:hAnsi="Times New Roman" w:cs="Times New Roman"/>
-          <w:sz w:val="26"/>
-          <w:szCs w:val="26"/>
-        </w:rPr>
-        <w:br/>
-        <w:t xml:space="preserve">I’m also good at translating </w:t>
-      </w:r>
-      <w:r>
-        <w:rPr>
-          <w:rStyle w:val="Strong"/>
-          <w:rFonts w:ascii="Times New Roman" w:hAnsi="Times New Roman" w:cs="Times New Roman"/>
-          <w:sz w:val="26"/>
-          <w:szCs w:val="26"/>
-        </w:rPr>
-        <w:t>business requirements into clean, maintainable technical solutions</w:t>
-      </w:r>
-      <w:r>
-        <w:rPr>
-          <w:rFonts w:ascii="Times New Roman" w:hAnsi="Times New Roman" w:cs="Times New Roman"/>
-          <w:sz w:val="26"/>
-          <w:szCs w:val="26"/>
-        </w:rPr>
-        <w:t>, and I actively contribute during design and code reviews as a team player</w:t>
-      </w:r>
-    </w:p>
-    <w:p>
-      <w:pPr>
-        <w:pStyle w:val="ListParagraph"/>
-        <w:rPr>
-          <w:rFonts w:ascii="Times New Roman" w:hAnsi="Times New Roman" w:cs="Times New Roman"/>
-          <w:sz w:val="26"/>
-          <w:szCs w:val="26"/>
-          <w:lang w:val="en-US"/>
+        <w:t xml:space="preserve">However, I’m open to discussion depending on the </w:t>
+      </w:r>
+      <w:r>
+        <w:rPr>
+          <w:rStyle w:val="Strong"/>
+          <w:rFonts w:ascii="Times New Roman" w:hAnsi="Times New Roman" w:cs="Times New Roman"/>
+          <w:sz w:val="26"/>
+          <w:szCs w:val="26"/>
+        </w:rPr>
+        <w:t>role, responsibilities, and overall growth opportunities</w:t>
+      </w:r>
+    </w:p>
+    <w:p>
+      <w:pPr>
+        <w:pStyle w:val="ListParagraph"/>
+        <w:rPr>
+          <w:rStyle w:val="Strong"/>
+          <w:rFonts w:ascii="Times New Roman" w:hAnsi="Times New Roman" w:cs="Times New Roman"/>
+          <w:sz w:val="26"/>
+          <w:szCs w:val="26"/>
         </w:rPr>
       </w:pPr>
     </w:p>
@@ -1033,172 +871,42 @@
           <w:sz w:val="32"/>
           <w:szCs w:val="32"/>
         </w:rPr>
-        <w:t>What are your weaknesses?</w:t>
-      </w:r>
-    </w:p>
-    <w:p>
-      <w:pPr>
-        <w:pStyle w:val="ListParagraph"/>
-        <w:rPr>
-          <w:rFonts w:ascii="Times New Roman" w:hAnsi="Times New Roman" w:cs="Times New Roman"/>
-          <w:b/>
-          <w:sz w:val="26"/>
-          <w:szCs w:val="26"/>
-          <w:lang w:val="en-US"/>
-        </w:rPr>
-      </w:pPr>
-      <w:r>
-        <w:rPr>
-          <w:rFonts w:ascii="Times New Roman" w:hAnsi="Times New Roman" w:cs="Times New Roman"/>
-          <w:b/>
-          <w:sz w:val="26"/>
-          <w:szCs w:val="26"/>
-        </w:rPr>
-        <w:t>HR Round</w:t>
-      </w:r>
-    </w:p>
-    <w:p>
-      <w:pPr>
-        <w:pStyle w:val="ListParagraph"/>
-        <w:rPr>
-          <w:rFonts w:ascii="Times New Roman" w:hAnsi="Times New Roman" w:cs="Times New Roman"/>
-          <w:sz w:val="26"/>
-          <w:szCs w:val="26"/>
-        </w:rPr>
-      </w:pPr>
-      <w:r>
-        <w:rPr>
-          <w:rFonts w:ascii="Times New Roman" w:hAnsi="Times New Roman" w:cs="Times New Roman"/>
-          <w:sz w:val="26"/>
-          <w:szCs w:val="26"/>
-        </w:rPr>
-        <w:t>Earlier, I used to spend extra time perfecting every piece of code, which sometimes affected timelines.</w:t>
-      </w:r>
-      <w:r>
-        <w:rPr>
-          <w:rFonts w:ascii="Times New Roman" w:hAnsi="Times New Roman" w:cs="Times New Roman"/>
-          <w:sz w:val="26"/>
-          <w:szCs w:val="26"/>
-        </w:rPr>
-        <w:br/>
-        <w:t xml:space="preserve">Over time, I’ve learned to </w:t>
-      </w:r>
-      <w:r>
-        <w:rPr>
-          <w:rStyle w:val="Strong"/>
-          <w:rFonts w:ascii="Times New Roman" w:hAnsi="Times New Roman" w:cs="Times New Roman"/>
-          <w:sz w:val="26"/>
-          <w:szCs w:val="26"/>
-        </w:rPr>
-        <w:t>balance quality with efficiency</w:t>
-      </w:r>
-      <w:r>
-        <w:rPr>
-          <w:rFonts w:ascii="Times New Roman" w:hAnsi="Times New Roman" w:cs="Times New Roman"/>
-          <w:sz w:val="26"/>
-          <w:szCs w:val="26"/>
-        </w:rPr>
-        <w:t xml:space="preserve">. Now I focus on delivering solutions that are both </w:t>
-      </w:r>
-      <w:r>
-        <w:rPr>
-          <w:rStyle w:val="Strong"/>
-          <w:rFonts w:ascii="Times New Roman" w:hAnsi="Times New Roman" w:cs="Times New Roman"/>
-          <w:sz w:val="26"/>
-          <w:szCs w:val="26"/>
-        </w:rPr>
-        <w:t>clean and scalable</w:t>
-      </w:r>
-      <w:r>
-        <w:rPr>
-          <w:rFonts w:ascii="Times New Roman" w:hAnsi="Times New Roman" w:cs="Times New Roman"/>
-          <w:sz w:val="26"/>
-          <w:szCs w:val="26"/>
-        </w:rPr>
-        <w:t>, while meeting project deadlines</w:t>
-      </w:r>
-    </w:p>
-    <w:p>
-      <w:pPr>
-        <w:pStyle w:val="ListParagraph"/>
-        <w:rPr>
-          <w:rFonts w:ascii="Times New Roman" w:hAnsi="Times New Roman" w:cs="Times New Roman"/>
-          <w:sz w:val="26"/>
-          <w:szCs w:val="26"/>
-        </w:rPr>
-      </w:pPr>
-    </w:p>
-    <w:p>
-      <w:pPr>
-        <w:pStyle w:val="ListParagraph"/>
-        <w:rPr>
-          <w:rFonts w:ascii="Times New Roman" w:hAnsi="Times New Roman" w:cs="Times New Roman"/>
-          <w:b/>
-          <w:sz w:val="26"/>
-          <w:szCs w:val="26"/>
-        </w:rPr>
-      </w:pPr>
-      <w:r>
-        <w:rPr>
-          <w:rFonts w:ascii="Times New Roman" w:hAnsi="Times New Roman" w:cs="Times New Roman"/>
-          <w:b/>
-          <w:sz w:val="26"/>
-          <w:szCs w:val="26"/>
-        </w:rPr>
-        <w:t>Technical Round</w:t>
-      </w:r>
-    </w:p>
-    <w:p>
-      <w:pPr>
-        <w:pStyle w:val="ListParagraph"/>
-        <w:rPr>
-          <w:rFonts w:ascii="Times New Roman" w:hAnsi="Times New Roman" w:cs="Times New Roman"/>
-          <w:sz w:val="26"/>
-          <w:szCs w:val="26"/>
-        </w:rPr>
-      </w:pPr>
-      <w:r>
-        <w:rPr>
-          <w:rFonts w:ascii="Times New Roman" w:hAnsi="Times New Roman" w:cs="Times New Roman"/>
-          <w:sz w:val="26"/>
-          <w:szCs w:val="26"/>
-        </w:rPr>
-        <w:t>In the past, I tended to spend too much time optimizing or refining code, which sometimes slowed down delivery.</w:t>
-      </w:r>
-      <w:r>
-        <w:rPr>
-          <w:rFonts w:ascii="Times New Roman" w:hAnsi="Times New Roman" w:cs="Times New Roman"/>
-          <w:sz w:val="26"/>
-          <w:szCs w:val="26"/>
-        </w:rPr>
-        <w:br/>
-        <w:t xml:space="preserve">I’ve improved by </w:t>
-      </w:r>
-      <w:r>
-        <w:rPr>
-          <w:rStyle w:val="Strong"/>
-          <w:rFonts w:ascii="Times New Roman" w:hAnsi="Times New Roman" w:cs="Times New Roman"/>
-          <w:sz w:val="26"/>
-          <w:szCs w:val="26"/>
-        </w:rPr>
-        <w:t>prioritizing critical areas for optimization</w:t>
-      </w:r>
-      <w:r>
-        <w:rPr>
-          <w:rFonts w:ascii="Times New Roman" w:hAnsi="Times New Roman" w:cs="Times New Roman"/>
-          <w:sz w:val="26"/>
-          <w:szCs w:val="26"/>
-        </w:rPr>
-        <w:t xml:space="preserve"> and adopting best practices for clean, maintainable code.</w:t>
-      </w:r>
-      <w:r>
-        <w:rPr>
-          <w:rFonts w:ascii="Times New Roman" w:hAnsi="Times New Roman" w:cs="Times New Roman"/>
-          <w:sz w:val="26"/>
-          <w:szCs w:val="26"/>
-        </w:rPr>
-        <w:br/>
-        <w:t>This way, I ensure high-quality solutions without compromising timelines</w:t>
+        <w:t>Salary expectation?</w:t>
+      </w:r>
+    </w:p>
+    <w:p>
+      <w:pPr>
+        <w:pStyle w:val="ListParagraph"/>
+        <w:rPr>
+          <w:rFonts w:ascii="Times New Roman" w:hAnsi="Times New Roman" w:cs="Times New Roman"/>
+          <w:sz w:val="26"/>
+          <w:szCs w:val="26"/>
+        </w:rPr>
+      </w:pPr>
+      <w:r>
+        <w:rPr>
+          <w:rFonts w:ascii="Times New Roman" w:hAnsi="Times New Roman" w:cs="Times New Roman"/>
+          <w:sz w:val="26"/>
+          <w:szCs w:val="26"/>
+        </w:rPr>
+        <w:t xml:space="preserve">I’m looking for a </w:t>
+      </w:r>
+      <w:r>
+        <w:rPr>
+          <w:rStyle w:val="Strong"/>
+          <w:rFonts w:ascii="Times New Roman" w:hAnsi="Times New Roman" w:cs="Times New Roman"/>
+          <w:sz w:val="26"/>
+          <w:szCs w:val="26"/>
+        </w:rPr>
+        <w:t>market-aligned and role-appropriate compensation</w:t>
+      </w:r>
+      <w:r>
+        <w:rPr>
+          <w:rFonts w:ascii="Times New Roman" w:hAnsi="Times New Roman" w:cs="Times New Roman"/>
+          <w:sz w:val="26"/>
+          <w:szCs w:val="26"/>
+        </w:rPr>
+        <w:t>, and I’m flexible depending on the responsibilities, growth opportunities, and overall package</w:t>
       </w:r>
     </w:p>
     <w:p>
@@ -1234,293 +942,107 @@
           <w:sz w:val="32"/>
           <w:szCs w:val="32"/>
         </w:rPr>
-        <w:t>Where do you see yourself in 3–5 years?</w:t>
-      </w:r>
-    </w:p>
-    <w:p>
-      <w:pPr>
-        <w:pStyle w:val="ListParagraph"/>
-        <w:rPr>
-          <w:rFonts w:ascii="Times New Roman" w:hAnsi="Times New Roman" w:cs="Times New Roman"/>
-          <w:b/>
-          <w:sz w:val="26"/>
-          <w:szCs w:val="26"/>
-          <w:lang w:val="en-US"/>
-        </w:rPr>
-      </w:pPr>
-      <w:r>
-        <w:rPr>
-          <w:rFonts w:ascii="Times New Roman" w:hAnsi="Times New Roman" w:cs="Times New Roman"/>
-          <w:b/>
-          <w:sz w:val="26"/>
-          <w:szCs w:val="26"/>
-        </w:rPr>
-        <w:t>HR Round</w:t>
-      </w:r>
-    </w:p>
-    <w:p>
-      <w:pPr>
-        <w:pStyle w:val="ListParagraph"/>
-        <w:rPr>
-          <w:rFonts w:ascii="Times New Roman" w:hAnsi="Times New Roman" w:cs="Times New Roman"/>
-          <w:sz w:val="26"/>
-          <w:szCs w:val="26"/>
-        </w:rPr>
-      </w:pPr>
-      <w:r>
-        <w:rPr>
-          <w:rFonts w:ascii="Times New Roman" w:hAnsi="Times New Roman" w:cs="Times New Roman"/>
-          <w:sz w:val="26"/>
-          <w:szCs w:val="26"/>
-        </w:rPr>
-        <w:t xml:space="preserve">In the next 3–5 years, I see myself in a </w:t>
-      </w:r>
-      <w:r>
-        <w:rPr>
-          <w:rStyle w:val="Strong"/>
-          <w:rFonts w:ascii="Times New Roman" w:hAnsi="Times New Roman" w:cs="Times New Roman"/>
-          <w:sz w:val="26"/>
-          <w:szCs w:val="26"/>
-        </w:rPr>
-        <w:t>leadership role</w:t>
-      </w:r>
-      <w:r>
-        <w:rPr>
-          <w:rFonts w:ascii="Times New Roman" w:hAnsi="Times New Roman" w:cs="Times New Roman"/>
-          <w:sz w:val="26"/>
-          <w:szCs w:val="26"/>
-        </w:rPr>
-        <w:t>, such as a Lead Engineer or Solution Architect.</w:t>
-      </w:r>
-      <w:r>
-        <w:rPr>
-          <w:rFonts w:ascii="Times New Roman" w:hAnsi="Times New Roman" w:cs="Times New Roman"/>
-          <w:sz w:val="26"/>
-          <w:szCs w:val="26"/>
-        </w:rPr>
-        <w:br/>
-        <w:t xml:space="preserve">I aim to </w:t>
-      </w:r>
-      <w:r>
-        <w:rPr>
-          <w:rStyle w:val="Strong"/>
-          <w:rFonts w:ascii="Times New Roman" w:hAnsi="Times New Roman" w:cs="Times New Roman"/>
-          <w:sz w:val="26"/>
-          <w:szCs w:val="26"/>
-        </w:rPr>
-        <w:t>mentor junior team members, drive project success</w:t>
-      </w:r>
-      <w:r>
-        <w:rPr>
-          <w:rFonts w:ascii="Times New Roman" w:hAnsi="Times New Roman" w:cs="Times New Roman"/>
-          <w:sz w:val="26"/>
-          <w:szCs w:val="26"/>
-        </w:rPr>
-        <w:t xml:space="preserve">, and contribute to </w:t>
-      </w:r>
-      <w:r>
-        <w:rPr>
-          <w:rStyle w:val="Strong"/>
-          <w:rFonts w:ascii="Times New Roman" w:hAnsi="Times New Roman" w:cs="Times New Roman"/>
-          <w:sz w:val="26"/>
-          <w:szCs w:val="26"/>
-        </w:rPr>
-        <w:t>building scalable products that deliver real value to users</w:t>
-      </w:r>
-      <w:r>
-        <w:rPr>
-          <w:rFonts w:ascii="Times New Roman" w:hAnsi="Times New Roman" w:cs="Times New Roman"/>
-          <w:sz w:val="26"/>
-          <w:szCs w:val="26"/>
+        <w:lastRenderedPageBreak/>
+        <w:t>How many years of experience do you have?</w:t>
+      </w:r>
+    </w:p>
+    <w:p>
+      <w:pPr>
+        <w:pStyle w:val="ListParagraph"/>
+        <w:rPr>
+          <w:rFonts w:ascii="Times New Roman" w:hAnsi="Times New Roman" w:cs="Times New Roman"/>
+          <w:sz w:val="24"/>
+          <w:szCs w:val="24"/>
+        </w:rPr>
+      </w:pPr>
+      <w:r>
+        <w:rPr>
+          <w:rFonts w:ascii="Times New Roman" w:hAnsi="Times New Roman" w:cs="Times New Roman"/>
+          <w:sz w:val="24"/>
+          <w:szCs w:val="24"/>
+        </w:rPr>
+        <w:t xml:space="preserve">I have 5 years of professional experience as a web developer, working extensively on the frontend and on backend CMS solutions such as WordPress, </w:t>
+      </w:r>
+      <w:proofErr w:type="spellStart"/>
+      <w:r>
+        <w:rPr>
+          <w:rFonts w:ascii="Times New Roman" w:hAnsi="Times New Roman" w:cs="Times New Roman"/>
+          <w:sz w:val="24"/>
+          <w:szCs w:val="24"/>
+        </w:rPr>
+        <w:t>Directus</w:t>
+      </w:r>
+      <w:proofErr w:type="spellEnd"/>
+      <w:r>
+        <w:rPr>
+          <w:rFonts w:ascii="Times New Roman" w:hAnsi="Times New Roman" w:cs="Times New Roman"/>
+          <w:sz w:val="24"/>
+          <w:szCs w:val="24"/>
+        </w:rPr>
+        <w:t xml:space="preserve">, and </w:t>
+      </w:r>
+      <w:proofErr w:type="spellStart"/>
+      <w:r>
+        <w:rPr>
+          <w:rFonts w:ascii="Times New Roman" w:hAnsi="Times New Roman" w:cs="Times New Roman"/>
+          <w:sz w:val="24"/>
+          <w:szCs w:val="24"/>
+        </w:rPr>
+        <w:t>Netlify</w:t>
+      </w:r>
+      <w:proofErr w:type="spellEnd"/>
+      <w:r>
+        <w:rPr>
+          <w:rFonts w:ascii="Times New Roman" w:hAnsi="Times New Roman" w:cs="Times New Roman"/>
+          <w:sz w:val="24"/>
+          <w:szCs w:val="24"/>
+        </w:rPr>
+        <w:t xml:space="preserve"> CMS. Over the last 2+ years, I’ve also been building backend systems using Node.js, </w:t>
+      </w:r>
+      <w:proofErr w:type="spellStart"/>
+      <w:r>
+        <w:rPr>
+          <w:rFonts w:ascii="Times New Roman" w:hAnsi="Times New Roman" w:cs="Times New Roman"/>
+          <w:sz w:val="24"/>
+          <w:szCs w:val="24"/>
+        </w:rPr>
+        <w:t>NestJS</w:t>
+      </w:r>
+      <w:proofErr w:type="spellEnd"/>
+      <w:r>
+        <w:rPr>
+          <w:rFonts w:ascii="Times New Roman" w:hAnsi="Times New Roman" w:cs="Times New Roman"/>
+          <w:sz w:val="24"/>
+          <w:szCs w:val="24"/>
+        </w:rPr>
+        <w:t xml:space="preserve">, and </w:t>
+      </w:r>
+      <w:proofErr w:type="spellStart"/>
+      <w:r>
+        <w:rPr>
+          <w:rFonts w:ascii="Times New Roman" w:hAnsi="Times New Roman" w:cs="Times New Roman"/>
+          <w:sz w:val="24"/>
+          <w:szCs w:val="24"/>
+        </w:rPr>
+        <w:t>GraphQL</w:t>
+      </w:r>
+      <w:proofErr w:type="spellEnd"/>
+      <w:r>
+        <w:rPr>
+          <w:rFonts w:ascii="Times New Roman" w:hAnsi="Times New Roman" w:cs="Times New Roman"/>
+          <w:sz w:val="24"/>
+          <w:szCs w:val="24"/>
         </w:rPr>
         <w:t>.</w:t>
       </w:r>
-      <w:r>
-        <w:rPr>
-          <w:rFonts w:ascii="Times New Roman" w:hAnsi="Times New Roman" w:cs="Times New Roman"/>
-          <w:sz w:val="26"/>
-          <w:szCs w:val="26"/>
-        </w:rPr>
-        <w:br/>
-        <w:t xml:space="preserve">I’m looking for opportunities where I can </w:t>
-      </w:r>
-      <w:r>
-        <w:rPr>
-          <w:rStyle w:val="Strong"/>
-          <w:rFonts w:ascii="Times New Roman" w:hAnsi="Times New Roman" w:cs="Times New Roman"/>
-          <w:sz w:val="26"/>
-          <w:szCs w:val="26"/>
-        </w:rPr>
-        <w:t>grow technically and take on more responsibilities</w:t>
-      </w:r>
-      <w:r>
-        <w:rPr>
-          <w:rFonts w:ascii="Times New Roman" w:hAnsi="Times New Roman" w:cs="Times New Roman"/>
-          <w:sz w:val="26"/>
-          <w:szCs w:val="26"/>
-        </w:rPr>
-        <w:t>, while collaborating with talented teams</w:t>
-      </w:r>
-    </w:p>
-    <w:p>
-      <w:pPr>
-        <w:pStyle w:val="ListParagraph"/>
-        <w:rPr>
-          <w:rFonts w:ascii="Times New Roman" w:hAnsi="Times New Roman" w:cs="Times New Roman"/>
-          <w:sz w:val="26"/>
-          <w:szCs w:val="26"/>
-        </w:rPr>
-      </w:pPr>
-    </w:p>
-    <w:p>
-      <w:pPr>
-        <w:pStyle w:val="ListParagraph"/>
-        <w:rPr>
-          <w:rFonts w:ascii="Times New Roman" w:hAnsi="Times New Roman" w:cs="Times New Roman"/>
-          <w:b/>
-          <w:sz w:val="26"/>
-          <w:szCs w:val="26"/>
-        </w:rPr>
-      </w:pPr>
-      <w:r>
-        <w:rPr>
-          <w:rFonts w:ascii="Times New Roman" w:hAnsi="Times New Roman" w:cs="Times New Roman"/>
-          <w:b/>
-          <w:sz w:val="26"/>
-          <w:szCs w:val="26"/>
-        </w:rPr>
-        <w:t>Technical Round</w:t>
-      </w:r>
-    </w:p>
-    <w:p>
-      <w:pPr>
-        <w:pStyle w:val="ListParagraph"/>
-        <w:rPr>
-          <w:rFonts w:ascii="Times New Roman" w:hAnsi="Times New Roman" w:cs="Times New Roman"/>
-          <w:sz w:val="26"/>
-          <w:szCs w:val="26"/>
-        </w:rPr>
-      </w:pPr>
-      <w:r>
-        <w:rPr>
-          <w:rFonts w:ascii="Times New Roman" w:hAnsi="Times New Roman" w:cs="Times New Roman"/>
-          <w:sz w:val="26"/>
-          <w:szCs w:val="26"/>
-        </w:rPr>
-        <w:t xml:space="preserve">In 3–5 years, I envision myself as a </w:t>
-      </w:r>
-      <w:r>
-        <w:rPr>
-          <w:rStyle w:val="Strong"/>
-          <w:rFonts w:ascii="Times New Roman" w:hAnsi="Times New Roman" w:cs="Times New Roman"/>
-          <w:sz w:val="26"/>
-          <w:szCs w:val="26"/>
-        </w:rPr>
-        <w:t>Lead Engineer or Solution Architect</w:t>
-      </w:r>
-      <w:r>
-        <w:rPr>
-          <w:rFonts w:ascii="Times New Roman" w:hAnsi="Times New Roman" w:cs="Times New Roman"/>
-          <w:sz w:val="26"/>
-          <w:szCs w:val="26"/>
-        </w:rPr>
-        <w:t xml:space="preserve">, taking ownership of </w:t>
-      </w:r>
-      <w:r>
-        <w:rPr>
-          <w:rStyle w:val="Strong"/>
-          <w:rFonts w:ascii="Times New Roman" w:hAnsi="Times New Roman" w:cs="Times New Roman"/>
-          <w:sz w:val="26"/>
-          <w:szCs w:val="26"/>
-        </w:rPr>
-        <w:t>system design and architecture decisions</w:t>
-      </w:r>
-      <w:r>
-        <w:rPr>
-          <w:rFonts w:ascii="Times New Roman" w:hAnsi="Times New Roman" w:cs="Times New Roman"/>
-          <w:sz w:val="26"/>
-          <w:szCs w:val="26"/>
-        </w:rPr>
-        <w:t>.</w:t>
-      </w:r>
-      <w:r>
-        <w:rPr>
-          <w:rFonts w:ascii="Times New Roman" w:hAnsi="Times New Roman" w:cs="Times New Roman"/>
-          <w:sz w:val="26"/>
-          <w:szCs w:val="26"/>
-        </w:rPr>
-        <w:br/>
-        <w:t xml:space="preserve">I want to </w:t>
-      </w:r>
-      <w:r>
-        <w:rPr>
-          <w:rStyle w:val="Strong"/>
-          <w:rFonts w:ascii="Times New Roman" w:hAnsi="Times New Roman" w:cs="Times New Roman"/>
-          <w:sz w:val="26"/>
-          <w:szCs w:val="26"/>
-        </w:rPr>
-        <w:t>mentor juniors, review code for quality and scalability</w:t>
-      </w:r>
-      <w:r>
-        <w:rPr>
-          <w:rFonts w:ascii="Times New Roman" w:hAnsi="Times New Roman" w:cs="Times New Roman"/>
-          <w:sz w:val="26"/>
-          <w:szCs w:val="26"/>
-        </w:rPr>
-        <w:t xml:space="preserve">, and contribute to </w:t>
-      </w:r>
-      <w:r>
-        <w:rPr>
-          <w:rStyle w:val="Strong"/>
-          <w:rFonts w:ascii="Times New Roman" w:hAnsi="Times New Roman" w:cs="Times New Roman"/>
-          <w:sz w:val="26"/>
-          <w:szCs w:val="26"/>
-        </w:rPr>
-        <w:t>building robust, high-performance systems</w:t>
-      </w:r>
-      <w:r>
-        <w:rPr>
-          <w:rFonts w:ascii="Times New Roman" w:hAnsi="Times New Roman" w:cs="Times New Roman"/>
-          <w:sz w:val="26"/>
-          <w:szCs w:val="26"/>
-        </w:rPr>
-        <w:t xml:space="preserve"> that can scale efficiently.</w:t>
-      </w:r>
-      <w:r>
-        <w:rPr>
-          <w:rFonts w:ascii="Times New Roman" w:hAnsi="Times New Roman" w:cs="Times New Roman"/>
-          <w:sz w:val="26"/>
-          <w:szCs w:val="26"/>
-        </w:rPr>
-        <w:br/>
-        <w:t xml:space="preserve">My goal is to combine </w:t>
-      </w:r>
-      <w:r>
-        <w:rPr>
-          <w:rStyle w:val="Strong"/>
-          <w:rFonts w:ascii="Times New Roman" w:hAnsi="Times New Roman" w:cs="Times New Roman"/>
-          <w:sz w:val="26"/>
-          <w:szCs w:val="26"/>
-        </w:rPr>
-        <w:t>hands-on development with architectural responsibilities</w:t>
-      </w:r>
-      <w:r>
-        <w:rPr>
-          <w:rFonts w:ascii="Times New Roman" w:hAnsi="Times New Roman" w:cs="Times New Roman"/>
-          <w:sz w:val="26"/>
-          <w:szCs w:val="26"/>
-        </w:rPr>
-        <w:t xml:space="preserve"> to solve complex technical challenges</w:t>
-      </w:r>
-    </w:p>
-    <w:p>
-      <w:pPr>
-        <w:pStyle w:val="ListParagraph"/>
-        <w:rPr>
-          <w:rFonts w:ascii="Times New Roman" w:hAnsi="Times New Roman" w:cs="Times New Roman"/>
-          <w:sz w:val="26"/>
-          <w:szCs w:val="26"/>
-          <w:lang w:val="en-US"/>
+    </w:p>
+    <w:p>
+      <w:pPr>
+        <w:pStyle w:val="ListParagraph"/>
+        <w:rPr>
+          <w:rFonts w:ascii="Times New Roman" w:hAnsi="Times New Roman" w:cs="Times New Roman"/>
+          <w:sz w:val="24"/>
+          <w:szCs w:val="24"/>
         </w:rPr>
       </w:pPr>
     </w:p>
@@ -1546,7 +1068,7 @@
           <w:sz w:val="32"/>
           <w:szCs w:val="32"/>
         </w:rPr>
-        <w:t>Why should we hire you?</w:t>
+        <w:t>What is your current role/responsibility?</w:t>
       </w:r>
     </w:p>
     <w:p>
@@ -1574,35 +1096,36 @@
       <w:pPr>
         <w:pStyle w:val="ListParagraph"/>
         <w:rPr>
-          <w:rFonts w:ascii="Times New Roman" w:hAnsi="Times New Roman" w:cs="Times New Roman"/>
-          <w:sz w:val="26"/>
-          <w:szCs w:val="26"/>
-        </w:rPr>
-      </w:pPr>
-      <w:r>
-        <w:rPr>
-          <w:rFonts w:ascii="Times New Roman" w:hAnsi="Times New Roman" w:cs="Times New Roman"/>
-          <w:sz w:val="26"/>
-          <w:szCs w:val="26"/>
-        </w:rPr>
-        <w:t xml:space="preserve">You should hire me because I bring </w:t>
-      </w:r>
-      <w:r>
-        <w:rPr>
-          <w:rStyle w:val="Strong"/>
-          <w:rFonts w:ascii="Times New Roman" w:hAnsi="Times New Roman" w:cs="Times New Roman"/>
-          <w:sz w:val="26"/>
-          <w:szCs w:val="26"/>
-        </w:rPr>
-        <w:t>hands-on experience with production-level applications</w:t>
-      </w:r>
-      <w:r>
-        <w:rPr>
-          <w:rFonts w:ascii="Times New Roman" w:hAnsi="Times New Roman" w:cs="Times New Roman"/>
-          <w:sz w:val="26"/>
-          <w:szCs w:val="26"/>
-        </w:rPr>
-        <w:t>, strong frontend expertise, and a solid understanding of backend systems.</w:t>
+          <w:rStyle w:val="Strong"/>
+          <w:rFonts w:ascii="Times New Roman" w:hAnsi="Times New Roman" w:cs="Times New Roman"/>
+          <w:sz w:val="26"/>
+          <w:szCs w:val="26"/>
+        </w:rPr>
+      </w:pPr>
+      <w:r>
+        <w:rPr>
+          <w:rFonts w:ascii="Times New Roman" w:hAnsi="Times New Roman" w:cs="Times New Roman"/>
+          <w:sz w:val="26"/>
+          <w:szCs w:val="26"/>
+        </w:rPr>
+        <w:t xml:space="preserve">I currently work as a </w:t>
+      </w:r>
+      <w:r>
+        <w:rPr>
+          <w:rStyle w:val="Strong"/>
+          <w:rFonts w:ascii="Times New Roman" w:hAnsi="Times New Roman" w:cs="Times New Roman"/>
+          <w:sz w:val="26"/>
+          <w:szCs w:val="26"/>
+        </w:rPr>
+        <w:t>Senior Software Engineer</w:t>
+      </w:r>
+      <w:r>
+        <w:rPr>
+          <w:rFonts w:ascii="Times New Roman" w:hAnsi="Times New Roman" w:cs="Times New Roman"/>
+          <w:sz w:val="26"/>
+          <w:szCs w:val="26"/>
+        </w:rPr>
+        <w:t>, responsible for building and maintaining web applications end-to-end.</w:t>
       </w:r>
       <w:r>
         <w:rPr>
@@ -1611,41 +1134,44 @@
           <w:szCs w:val="26"/>
         </w:rPr>
         <w:br/>
-        <w:t xml:space="preserve">I can </w:t>
-      </w:r>
-      <w:r>
-        <w:rPr>
-          <w:rStyle w:val="Strong"/>
-          <w:rFonts w:ascii="Times New Roman" w:hAnsi="Times New Roman" w:cs="Times New Roman"/>
-          <w:sz w:val="26"/>
-          <w:szCs w:val="26"/>
-        </w:rPr>
-        <w:t>take ownership of features end-to-end</w:t>
-      </w:r>
-      <w:r>
-        <w:rPr>
-          <w:rFonts w:ascii="Times New Roman" w:hAnsi="Times New Roman" w:cs="Times New Roman"/>
-          <w:sz w:val="26"/>
-          <w:szCs w:val="26"/>
-        </w:rPr>
-        <w:t>, adapt quickly to new challenges, and contribute effectively from day one while growing with the organization</w:t>
-      </w:r>
-      <w:r>
-        <w:rPr>
-          <w:rFonts w:ascii="Times New Roman" w:hAnsi="Times New Roman" w:cs="Times New Roman"/>
-          <w:sz w:val="26"/>
-          <w:szCs w:val="26"/>
-        </w:rPr>
-        <w:t xml:space="preserve"> </w:t>
-      </w:r>
-    </w:p>
-    <w:p>
-      <w:pPr>
-        <w:pStyle w:val="ListParagraph"/>
-        <w:rPr>
-          <w:rFonts w:ascii="Times New Roman" w:hAnsi="Times New Roman" w:cs="Times New Roman"/>
-          <w:sz w:val="26"/>
-          <w:szCs w:val="26"/>
+        <w:t xml:space="preserve">I collaborate closely with </w:t>
+      </w:r>
+      <w:r>
+        <w:rPr>
+          <w:rStyle w:val="Strong"/>
+          <w:rFonts w:ascii="Times New Roman" w:hAnsi="Times New Roman" w:cs="Times New Roman"/>
+          <w:sz w:val="26"/>
+          <w:szCs w:val="26"/>
+        </w:rPr>
+        <w:t>product, QA, and other stakeholders</w:t>
+      </w:r>
+      <w:r>
+        <w:rPr>
+          <w:rFonts w:ascii="Times New Roman" w:hAnsi="Times New Roman" w:cs="Times New Roman"/>
+          <w:sz w:val="26"/>
+          <w:szCs w:val="26"/>
+        </w:rPr>
+        <w:t xml:space="preserve">, handle integrations like payment systems, and actively participate in </w:t>
+      </w:r>
+      <w:r>
+        <w:rPr>
+          <w:rStyle w:val="Strong"/>
+          <w:rFonts w:ascii="Times New Roman" w:hAnsi="Times New Roman" w:cs="Times New Roman"/>
+          <w:sz w:val="26"/>
+          <w:szCs w:val="26"/>
+        </w:rPr>
+        <w:t>feature planning, code reviews, and team discussions</w:t>
+      </w:r>
+    </w:p>
+    <w:p>
+      <w:pPr>
+        <w:pStyle w:val="ListParagraph"/>
+        <w:rPr>
+          <w:rFonts w:ascii="Times New Roman" w:hAnsi="Times New Roman" w:cs="Times New Roman"/>
+          <w:b/>
+          <w:sz w:val="26"/>
+          <w:szCs w:val="26"/>
+          <w:lang w:val="en-US"/>
         </w:rPr>
       </w:pPr>
     </w:p>
@@ -1684,24 +1210,41 @@
           <w:sz w:val="26"/>
           <w:szCs w:val="26"/>
         </w:rPr>
-        <w:t xml:space="preserve">I bring </w:t>
-      </w:r>
-      <w:r>
-        <w:rPr>
-          <w:rStyle w:val="Strong"/>
-          <w:rFonts w:ascii="Times New Roman" w:hAnsi="Times New Roman" w:cs="Times New Roman"/>
-          <w:sz w:val="26"/>
-          <w:szCs w:val="26"/>
-        </w:rPr>
-        <w:t>4+ years of full-stack development experience</w:t>
-      </w:r>
-      <w:r>
-        <w:rPr>
-          <w:rFonts w:ascii="Times New Roman" w:hAnsi="Times New Roman" w:cs="Times New Roman"/>
-          <w:sz w:val="26"/>
-          <w:szCs w:val="26"/>
-        </w:rPr>
-        <w:t>, with strong skills in React.js, Next.js, and backend API development.</w:t>
+        <w:t xml:space="preserve">I work on </w:t>
+      </w:r>
+      <w:r>
+        <w:rPr>
+          <w:rStyle w:val="Strong"/>
+          <w:rFonts w:ascii="Times New Roman" w:hAnsi="Times New Roman" w:cs="Times New Roman"/>
+          <w:sz w:val="26"/>
+          <w:szCs w:val="26"/>
+        </w:rPr>
+        <w:t>frontend development using React and Next.js</w:t>
+      </w:r>
+      <w:r>
+        <w:rPr>
+          <w:rFonts w:ascii="Times New Roman" w:hAnsi="Times New Roman" w:cs="Times New Roman"/>
+          <w:sz w:val="26"/>
+          <w:szCs w:val="26"/>
+        </w:rPr>
+        <w:t xml:space="preserve"> and contribute to </w:t>
+      </w:r>
+      <w:r>
+        <w:rPr>
+          <w:rStyle w:val="Strong"/>
+          <w:rFonts w:ascii="Times New Roman" w:hAnsi="Times New Roman" w:cs="Times New Roman"/>
+          <w:sz w:val="26"/>
+          <w:szCs w:val="26"/>
+        </w:rPr>
+        <w:t>backend API development</w:t>
+      </w:r>
+      <w:r>
+        <w:rPr>
+          <w:rFonts w:ascii="Times New Roman" w:hAnsi="Times New Roman" w:cs="Times New Roman"/>
+          <w:sz w:val="26"/>
+          <w:szCs w:val="26"/>
+        </w:rPr>
+        <w:t>.</w:t>
       </w:r>
       <w:r>
         <w:rPr>
@@ -1710,52 +1253,76 @@
           <w:szCs w:val="26"/>
         </w:rPr>
         <w:br/>
-        <w:t xml:space="preserve">I can </w:t>
-      </w:r>
-      <w:r>
-        <w:rPr>
-          <w:rStyle w:val="Strong"/>
-          <w:rFonts w:ascii="Times New Roman" w:hAnsi="Times New Roman" w:cs="Times New Roman"/>
-          <w:sz w:val="26"/>
-          <w:szCs w:val="26"/>
-        </w:rPr>
-        <w:t>own features end-to-end</w:t>
-      </w:r>
-      <w:r>
-        <w:rPr>
-          <w:rFonts w:ascii="Times New Roman" w:hAnsi="Times New Roman" w:cs="Times New Roman"/>
-          <w:sz w:val="26"/>
-          <w:szCs w:val="26"/>
-        </w:rPr>
-        <w:t xml:space="preserve">, including architecture, implementation, and integration with services like payment systems. I’m comfortable </w:t>
-      </w:r>
-      <w:r>
-        <w:rPr>
-          <w:rStyle w:val="Strong"/>
-          <w:rFonts w:ascii="Times New Roman" w:hAnsi="Times New Roman" w:cs="Times New Roman"/>
-          <w:sz w:val="26"/>
-          <w:szCs w:val="26"/>
-        </w:rPr>
-        <w:t>debugging complex issues, optimizing performance</w:t>
-      </w:r>
-      <w:r>
-        <w:rPr>
-          <w:rFonts w:ascii="Times New Roman" w:hAnsi="Times New Roman" w:cs="Times New Roman"/>
-          <w:sz w:val="26"/>
-          <w:szCs w:val="26"/>
-        </w:rPr>
-        <w:t>, and ensuring scalable, maintainable code</w:t>
-      </w:r>
-    </w:p>
-    <w:p>
-      <w:pPr>
-        <w:pStyle w:val="ListParagraph"/>
-        <w:rPr>
-          <w:rFonts w:ascii="Times New Roman" w:hAnsi="Times New Roman" w:cs="Times New Roman"/>
-          <w:sz w:val="26"/>
-          <w:szCs w:val="26"/>
-        </w:rPr>
-      </w:pPr>
+        <w:t xml:space="preserve">I’ve handled </w:t>
+      </w:r>
+      <w:r>
+        <w:rPr>
+          <w:rStyle w:val="Strong"/>
+          <w:rFonts w:ascii="Times New Roman" w:hAnsi="Times New Roman" w:cs="Times New Roman"/>
+          <w:sz w:val="26"/>
+          <w:szCs w:val="26"/>
+        </w:rPr>
+        <w:t>complex integrations like payment gateways</w:t>
+      </w:r>
+      <w:r>
+        <w:rPr>
+          <w:rFonts w:ascii="Times New Roman" w:hAnsi="Times New Roman" w:cs="Times New Roman"/>
+          <w:sz w:val="26"/>
+          <w:szCs w:val="26"/>
+        </w:rPr>
+        <w:t xml:space="preserve">, optimized existing systems for performance, and ensured </w:t>
+      </w:r>
+      <w:r>
+        <w:rPr>
+          <w:rStyle w:val="Strong"/>
+          <w:rFonts w:ascii="Times New Roman" w:hAnsi="Times New Roman" w:cs="Times New Roman"/>
+          <w:sz w:val="26"/>
+          <w:szCs w:val="26"/>
+        </w:rPr>
+        <w:t>scalable, maintainable code</w:t>
+      </w:r>
+      <w:r>
+        <w:rPr>
+          <w:rFonts w:ascii="Times New Roman" w:hAnsi="Times New Roman" w:cs="Times New Roman"/>
+          <w:sz w:val="26"/>
+          <w:szCs w:val="26"/>
+        </w:rPr>
+        <w:t>.</w:t>
+      </w:r>
+      <w:r>
+        <w:rPr>
+          <w:rFonts w:ascii="Times New Roman" w:hAnsi="Times New Roman" w:cs="Times New Roman"/>
+          <w:sz w:val="26"/>
+          <w:szCs w:val="26"/>
+        </w:rPr>
+        <w:br/>
+        <w:t xml:space="preserve">I also participate in </w:t>
+      </w:r>
+      <w:r>
+        <w:rPr>
+          <w:rStyle w:val="Strong"/>
+          <w:rFonts w:ascii="Times New Roman" w:hAnsi="Times New Roman" w:cs="Times New Roman"/>
+          <w:sz w:val="26"/>
+          <w:szCs w:val="26"/>
+        </w:rPr>
+        <w:t>feature planning, code reviews</w:t>
+      </w:r>
+      <w:r>
+        <w:rPr>
+          <w:rFonts w:ascii="Times New Roman" w:hAnsi="Times New Roman" w:cs="Times New Roman"/>
+          <w:sz w:val="26"/>
+          <w:szCs w:val="26"/>
+        </w:rPr>
+        <w:t>, and architectural discussions</w:t>
+      </w:r>
+      <w:r>
+        <w:rPr>
+          <w:rFonts w:ascii="Times New Roman" w:hAnsi="Times New Roman" w:cs="Times New Roman"/>
+          <w:sz w:val="26"/>
+          <w:szCs w:val="26"/>
+        </w:rPr>
+        <w:br/>
+      </w:r>
     </w:p>
     <w:p>
       <w:pPr>
@@ -1779,97 +1346,64 @@
           <w:sz w:val="32"/>
           <w:szCs w:val="32"/>
         </w:rPr>
-        <w:t>What is your current CTC and expected CTC?</w:t>
-      </w:r>
-    </w:p>
-    <w:p>
-      <w:pPr>
-        <w:pStyle w:val="ListParagraph"/>
-        <w:rPr>
-          <w:rFonts w:ascii="Times New Roman" w:hAnsi="Times New Roman" w:cs="Times New Roman"/>
-          <w:b/>
-          <w:bCs/>
-          <w:sz w:val="26"/>
-          <w:szCs w:val="26"/>
-        </w:rPr>
-      </w:pPr>
-      <w:r>
-        <w:rPr>
-          <w:rFonts w:ascii="Times New Roman" w:hAnsi="Times New Roman" w:cs="Times New Roman"/>
-          <w:sz w:val="26"/>
-          <w:szCs w:val="26"/>
-        </w:rPr>
-        <w:t xml:space="preserve">My current CTC is </w:t>
-      </w:r>
-      <w:r>
-        <w:rPr>
-          <w:rStyle w:val="Strong"/>
-          <w:rFonts w:ascii="Times New Roman" w:hAnsi="Times New Roman" w:cs="Times New Roman"/>
-          <w:sz w:val="26"/>
-          <w:szCs w:val="26"/>
-        </w:rPr>
-        <w:t>₹9 LPA</w:t>
-      </w:r>
-      <w:r>
-        <w:rPr>
-          <w:rFonts w:ascii="Times New Roman" w:hAnsi="Times New Roman" w:cs="Times New Roman"/>
-          <w:sz w:val="26"/>
-          <w:szCs w:val="26"/>
-        </w:rPr>
-        <w:t xml:space="preserve">. Based on my experience, skill set, and current market standards, I’m looking for a compensation in the range of </w:t>
-      </w:r>
-      <w:r>
-        <w:rPr>
-          <w:rStyle w:val="Strong"/>
-          <w:rFonts w:ascii="Times New Roman" w:hAnsi="Times New Roman" w:cs="Times New Roman"/>
-          <w:sz w:val="26"/>
-          <w:szCs w:val="26"/>
-        </w:rPr>
-        <w:t>₹14–15.5 LPA</w:t>
-      </w:r>
-      <w:r>
-        <w:rPr>
-          <w:rFonts w:ascii="Times New Roman" w:hAnsi="Times New Roman" w:cs="Times New Roman"/>
-          <w:sz w:val="26"/>
-          <w:szCs w:val="26"/>
-        </w:rPr>
-        <w:t xml:space="preserve">, which is roughly a </w:t>
-      </w:r>
-      <w:r>
-        <w:rPr>
-          <w:rStyle w:val="Strong"/>
-          <w:rFonts w:ascii="Times New Roman" w:hAnsi="Times New Roman" w:cs="Times New Roman"/>
-          <w:sz w:val="26"/>
-          <w:szCs w:val="26"/>
-        </w:rPr>
-        <w:t>60–70% hike</w:t>
-      </w:r>
-      <w:r>
-        <w:rPr>
-          <w:rFonts w:ascii="Times New Roman" w:hAnsi="Times New Roman" w:cs="Times New Roman"/>
-          <w:sz w:val="26"/>
-          <w:szCs w:val="26"/>
-        </w:rPr>
-        <w:t>.</w:t>
-      </w:r>
-      <w:r>
-        <w:rPr>
-          <w:rFonts w:ascii="Times New Roman" w:hAnsi="Times New Roman" w:cs="Times New Roman"/>
-          <w:sz w:val="26"/>
-          <w:szCs w:val="26"/>
-        </w:rPr>
-        <w:br/>
-        <w:t xml:space="preserve">However, I’m open to discussion depending on the </w:t>
-      </w:r>
-      <w:r>
-        <w:rPr>
-          <w:rStyle w:val="Strong"/>
-          <w:rFonts w:ascii="Times New Roman" w:hAnsi="Times New Roman" w:cs="Times New Roman"/>
-          <w:sz w:val="26"/>
-          <w:szCs w:val="26"/>
-        </w:rPr>
-        <w:t>role, responsibilities, and overall growth opportunities</w:t>
-      </w:r>
+        <w:t>What is your notice period?</w:t>
+      </w:r>
+    </w:p>
+    <w:p>
+      <w:pPr>
+        <w:pStyle w:val="ListParagraph"/>
+        <w:rPr>
+          <w:rStyle w:val="Strong"/>
+          <w:rFonts w:ascii="Times New Roman" w:hAnsi="Times New Roman" w:cs="Times New Roman"/>
+          <w:sz w:val="26"/>
+          <w:szCs w:val="26"/>
+        </w:rPr>
+      </w:pPr>
+      <w:r>
+        <w:rPr>
+          <w:rFonts w:ascii="Times New Roman" w:hAnsi="Times New Roman" w:cs="Times New Roman"/>
+          <w:sz w:val="26"/>
+          <w:szCs w:val="26"/>
+        </w:rPr>
+        <w:t xml:space="preserve">My notice period is </w:t>
+      </w:r>
+      <w:r>
+        <w:rPr>
+          <w:rStyle w:val="Strong"/>
+          <w:rFonts w:ascii="Times New Roman" w:hAnsi="Times New Roman" w:cs="Times New Roman"/>
+          <w:sz w:val="26"/>
+          <w:szCs w:val="26"/>
+        </w:rPr>
+        <w:t>60 days</w:t>
+      </w:r>
+      <w:r>
+        <w:rPr>
+          <w:rFonts w:ascii="Times New Roman" w:hAnsi="Times New Roman" w:cs="Times New Roman"/>
+          <w:sz w:val="26"/>
+          <w:szCs w:val="26"/>
+        </w:rPr>
+        <w:t xml:space="preserve">. However, I can try to negotiate an </w:t>
+      </w:r>
+      <w:r>
+        <w:rPr>
+          <w:rStyle w:val="Strong"/>
+          <w:rFonts w:ascii="Times New Roman" w:hAnsi="Times New Roman" w:cs="Times New Roman"/>
+          <w:sz w:val="26"/>
+          <w:szCs w:val="26"/>
+        </w:rPr>
+        <w:t>early release if required</w:t>
+      </w:r>
+    </w:p>
+    <w:p>
+      <w:pPr>
+        <w:pStyle w:val="ListParagraph"/>
+        <w:rPr>
+          <w:rFonts w:ascii="Times New Roman" w:hAnsi="Times New Roman" w:cs="Times New Roman"/>
+          <w:sz w:val="26"/>
+          <w:szCs w:val="26"/>
+          <w:lang w:val="en-US"/>
+        </w:rPr>
+      </w:pPr>
     </w:p>
     <w:p>
       <w:pPr>
@@ -1904,51 +1438,325 @@
           <w:sz w:val="32"/>
           <w:szCs w:val="32"/>
         </w:rPr>
-        <w:t>Salary expectation</w:t>
-      </w:r>
-      <w:r>
-        <w:rPr>
-          <w:rFonts w:ascii="Times New Roman" w:hAnsi="Times New Roman" w:cs="Times New Roman"/>
-          <w:b/>
-          <w:sz w:val="32"/>
-          <w:szCs w:val="32"/>
-        </w:rPr>
-        <w:t>?</w:t>
-      </w:r>
-    </w:p>
-    <w:p>
-      <w:pPr>
-        <w:pStyle w:val="ListParagraph"/>
-        <w:rPr>
-          <w:rFonts w:ascii="Times New Roman" w:hAnsi="Times New Roman" w:cs="Times New Roman"/>
-          <w:sz w:val="26"/>
-          <w:szCs w:val="26"/>
-        </w:rPr>
-      </w:pPr>
-      <w:r>
-        <w:rPr>
-          <w:rFonts w:ascii="Times New Roman" w:hAnsi="Times New Roman" w:cs="Times New Roman"/>
-          <w:sz w:val="26"/>
-          <w:szCs w:val="26"/>
-        </w:rPr>
-        <w:t xml:space="preserve">I’m looking for a </w:t>
-      </w:r>
-      <w:r>
-        <w:rPr>
-          <w:rStyle w:val="Strong"/>
-          <w:rFonts w:ascii="Times New Roman" w:hAnsi="Times New Roman" w:cs="Times New Roman"/>
-          <w:sz w:val="26"/>
-          <w:szCs w:val="26"/>
-        </w:rPr>
-        <w:t>market-aligned and role-appropriate compensation</w:t>
-      </w:r>
-      <w:r>
-        <w:rPr>
-          <w:rFonts w:ascii="Times New Roman" w:hAnsi="Times New Roman" w:cs="Times New Roman"/>
-          <w:sz w:val="26"/>
-          <w:szCs w:val="26"/>
-        </w:rPr>
-        <w:t>, and I’m flexible depending on the responsibilities, growth opportunities, and overall package</w:t>
+        <w:t>What are your strengths?</w:t>
+      </w:r>
+    </w:p>
+    <w:p>
+      <w:pPr>
+        <w:pStyle w:val="ListParagraph"/>
+        <w:rPr>
+          <w:rFonts w:ascii="Times New Roman" w:hAnsi="Times New Roman" w:cs="Times New Roman"/>
+          <w:b/>
+          <w:sz w:val="26"/>
+          <w:szCs w:val="26"/>
+          <w:lang w:val="en-US"/>
+        </w:rPr>
+      </w:pPr>
+      <w:r>
+        <w:rPr>
+          <w:rFonts w:ascii="Times New Roman" w:hAnsi="Times New Roman" w:cs="Times New Roman"/>
+          <w:b/>
+          <w:sz w:val="26"/>
+          <w:szCs w:val="26"/>
+        </w:rPr>
+        <w:t>HR Round</w:t>
+      </w:r>
+    </w:p>
+    <w:p>
+      <w:pPr>
+        <w:pStyle w:val="ListParagraph"/>
+        <w:rPr>
+          <w:rFonts w:ascii="Times New Roman" w:hAnsi="Times New Roman" w:cs="Times New Roman"/>
+          <w:sz w:val="26"/>
+          <w:szCs w:val="26"/>
+        </w:rPr>
+      </w:pPr>
+      <w:r>
+        <w:rPr>
+          <w:rFonts w:ascii="Times New Roman" w:hAnsi="Times New Roman" w:cs="Times New Roman"/>
+          <w:sz w:val="26"/>
+          <w:szCs w:val="26"/>
+        </w:rPr>
+        <w:t xml:space="preserve">My key strengths include strong expertise in </w:t>
+      </w:r>
+      <w:r>
+        <w:rPr>
+          <w:rStyle w:val="Strong"/>
+          <w:rFonts w:ascii="Times New Roman" w:hAnsi="Times New Roman" w:cs="Times New Roman"/>
+          <w:sz w:val="26"/>
+          <w:szCs w:val="26"/>
+        </w:rPr>
+        <w:t>React.js and Next.js</w:t>
+      </w:r>
+      <w:r>
+        <w:rPr>
+          <w:rFonts w:ascii="Times New Roman" w:hAnsi="Times New Roman" w:cs="Times New Roman"/>
+          <w:sz w:val="26"/>
+          <w:szCs w:val="26"/>
+        </w:rPr>
+        <w:t xml:space="preserve">, along with a solid understanding of </w:t>
+      </w:r>
+      <w:r>
+        <w:rPr>
+          <w:rStyle w:val="Strong"/>
+          <w:rFonts w:ascii="Times New Roman" w:hAnsi="Times New Roman" w:cs="Times New Roman"/>
+          <w:sz w:val="26"/>
+          <w:szCs w:val="26"/>
+        </w:rPr>
+        <w:t>full-stack development</w:t>
+      </w:r>
+      <w:r>
+        <w:rPr>
+          <w:rFonts w:ascii="Times New Roman" w:hAnsi="Times New Roman" w:cs="Times New Roman"/>
+          <w:sz w:val="26"/>
+          <w:szCs w:val="26"/>
+        </w:rPr>
+        <w:t>.</w:t>
+      </w:r>
+      <w:r>
+        <w:rPr>
+          <w:rFonts w:ascii="Times New Roman" w:hAnsi="Times New Roman" w:cs="Times New Roman"/>
+          <w:sz w:val="26"/>
+          <w:szCs w:val="26"/>
+        </w:rPr>
+        <w:br/>
+        <w:t xml:space="preserve">I have hands-on experience working on </w:t>
+      </w:r>
+      <w:r>
+        <w:rPr>
+          <w:rStyle w:val="Strong"/>
+          <w:rFonts w:ascii="Times New Roman" w:hAnsi="Times New Roman" w:cs="Times New Roman"/>
+          <w:sz w:val="26"/>
+          <w:szCs w:val="26"/>
+        </w:rPr>
+        <w:t>real-world production systems</w:t>
+      </w:r>
+      <w:r>
+        <w:rPr>
+          <w:rFonts w:ascii="Times New Roman" w:hAnsi="Times New Roman" w:cs="Times New Roman"/>
+          <w:sz w:val="26"/>
+          <w:szCs w:val="26"/>
+        </w:rPr>
+        <w:t>, which has helped me understand how technology aligns with business needs.</w:t>
+      </w:r>
+      <w:r>
+        <w:rPr>
+          <w:rFonts w:ascii="Times New Roman" w:hAnsi="Times New Roman" w:cs="Times New Roman"/>
+          <w:sz w:val="26"/>
+          <w:szCs w:val="26"/>
+        </w:rPr>
+        <w:br/>
+        <w:t xml:space="preserve">I’m good at </w:t>
+      </w:r>
+      <w:r>
+        <w:rPr>
+          <w:rStyle w:val="Strong"/>
+          <w:rFonts w:ascii="Times New Roman" w:hAnsi="Times New Roman" w:cs="Times New Roman"/>
+          <w:sz w:val="26"/>
+          <w:szCs w:val="26"/>
+        </w:rPr>
+        <w:t>problem-solving and debugging</w:t>
+      </w:r>
+      <w:r>
+        <w:rPr>
+          <w:rFonts w:ascii="Times New Roman" w:hAnsi="Times New Roman" w:cs="Times New Roman"/>
+          <w:sz w:val="26"/>
+          <w:szCs w:val="26"/>
+        </w:rPr>
+        <w:t xml:space="preserve">, and I can effectively convert </w:t>
+      </w:r>
+      <w:r>
+        <w:rPr>
+          <w:rStyle w:val="Strong"/>
+          <w:rFonts w:ascii="Times New Roman" w:hAnsi="Times New Roman" w:cs="Times New Roman"/>
+          <w:sz w:val="26"/>
+          <w:szCs w:val="26"/>
+        </w:rPr>
+        <w:t>business requirements into practical technical solutions</w:t>
+      </w:r>
+      <w:r>
+        <w:rPr>
+          <w:rFonts w:ascii="Times New Roman" w:hAnsi="Times New Roman" w:cs="Times New Roman"/>
+          <w:sz w:val="26"/>
+          <w:szCs w:val="26"/>
+        </w:rPr>
+        <w:t>.</w:t>
+      </w:r>
+      <w:r>
+        <w:rPr>
+          <w:rFonts w:ascii="Times New Roman" w:hAnsi="Times New Roman" w:cs="Times New Roman"/>
+          <w:sz w:val="26"/>
+          <w:szCs w:val="26"/>
+        </w:rPr>
+        <w:br/>
+        <w:t xml:space="preserve">Additionally, I’m a </w:t>
+      </w:r>
+      <w:r>
+        <w:rPr>
+          <w:rStyle w:val="Strong"/>
+          <w:rFonts w:ascii="Times New Roman" w:hAnsi="Times New Roman" w:cs="Times New Roman"/>
+          <w:sz w:val="26"/>
+          <w:szCs w:val="26"/>
+        </w:rPr>
+        <w:t>team player</w:t>
+      </w:r>
+      <w:r>
+        <w:rPr>
+          <w:rFonts w:ascii="Times New Roman" w:hAnsi="Times New Roman" w:cs="Times New Roman"/>
+          <w:sz w:val="26"/>
+          <w:szCs w:val="26"/>
+        </w:rPr>
+        <w:t xml:space="preserve"> who collaborates well with cross-functional teams to deliver results</w:t>
+      </w:r>
+    </w:p>
+    <w:p>
+      <w:pPr>
+        <w:pStyle w:val="ListParagraph"/>
+        <w:rPr>
+          <w:rFonts w:ascii="Times New Roman" w:hAnsi="Times New Roman" w:cs="Times New Roman"/>
+        </w:rPr>
+      </w:pPr>
+    </w:p>
+    <w:p>
+      <w:pPr>
+        <w:pStyle w:val="ListParagraph"/>
+        <w:rPr>
+          <w:rFonts w:ascii="Times New Roman" w:hAnsi="Times New Roman" w:cs="Times New Roman"/>
+          <w:b/>
+          <w:sz w:val="26"/>
+          <w:szCs w:val="26"/>
+        </w:rPr>
+      </w:pPr>
+      <w:r>
+        <w:rPr>
+          <w:rFonts w:ascii="Times New Roman" w:hAnsi="Times New Roman" w:cs="Times New Roman"/>
+          <w:b/>
+          <w:sz w:val="26"/>
+          <w:szCs w:val="26"/>
+        </w:rPr>
+        <w:t>Technical Round</w:t>
+      </w:r>
+    </w:p>
+    <w:p>
+      <w:pPr>
+        <w:pStyle w:val="ListParagraph"/>
+        <w:rPr>
+          <w:rFonts w:ascii="Times New Roman" w:hAnsi="Times New Roman" w:cs="Times New Roman"/>
+          <w:sz w:val="26"/>
+          <w:szCs w:val="26"/>
+        </w:rPr>
+      </w:pPr>
+      <w:r>
+        <w:rPr>
+          <w:rFonts w:ascii="Times New Roman" w:hAnsi="Times New Roman" w:cs="Times New Roman"/>
+          <w:sz w:val="26"/>
+          <w:szCs w:val="26"/>
+        </w:rPr>
+        <w:t xml:space="preserve">My core strength is my </w:t>
+      </w:r>
+      <w:r>
+        <w:rPr>
+          <w:rStyle w:val="Strong"/>
+          <w:rFonts w:ascii="Times New Roman" w:hAnsi="Times New Roman" w:cs="Times New Roman"/>
+          <w:sz w:val="26"/>
+          <w:szCs w:val="26"/>
+        </w:rPr>
+        <w:t>deep hands-on experience with React.js and Next.js</w:t>
+      </w:r>
+      <w:r>
+        <w:rPr>
+          <w:rFonts w:ascii="Times New Roman" w:hAnsi="Times New Roman" w:cs="Times New Roman"/>
+          <w:sz w:val="26"/>
+          <w:szCs w:val="26"/>
+        </w:rPr>
+        <w:t>, including building scalable and performance-optimized applications.</w:t>
+      </w:r>
+      <w:r>
+        <w:rPr>
+          <w:rFonts w:ascii="Times New Roman" w:hAnsi="Times New Roman" w:cs="Times New Roman"/>
+          <w:sz w:val="26"/>
+          <w:szCs w:val="26"/>
+        </w:rPr>
+        <w:br/>
+        <w:t xml:space="preserve">I have a strong understanding of </w:t>
+      </w:r>
+      <w:r>
+        <w:rPr>
+          <w:rStyle w:val="Strong"/>
+          <w:rFonts w:ascii="Times New Roman" w:hAnsi="Times New Roman" w:cs="Times New Roman"/>
+          <w:sz w:val="26"/>
+          <w:szCs w:val="26"/>
+        </w:rPr>
+        <w:t>full-stack architecture</w:t>
+      </w:r>
+      <w:r>
+        <w:rPr>
+          <w:rFonts w:ascii="Times New Roman" w:hAnsi="Times New Roman" w:cs="Times New Roman"/>
+          <w:sz w:val="26"/>
+          <w:szCs w:val="26"/>
+        </w:rPr>
+        <w:t xml:space="preserve">, API integrations, and </w:t>
+      </w:r>
+      <w:r>
+        <w:rPr>
+          <w:rFonts w:ascii="Times New Roman" w:hAnsi="Times New Roman" w:cs="Times New Roman"/>
+          <w:sz w:val="26"/>
+          <w:szCs w:val="26"/>
+        </w:rPr>
+        <w:lastRenderedPageBreak/>
+        <w:t>database interactions in production environments.</w:t>
+      </w:r>
+      <w:r>
+        <w:rPr>
+          <w:rFonts w:ascii="Times New Roman" w:hAnsi="Times New Roman" w:cs="Times New Roman"/>
+          <w:sz w:val="26"/>
+          <w:szCs w:val="26"/>
+        </w:rPr>
+        <w:br/>
+        <w:t xml:space="preserve">I’m comfortable working on </w:t>
+      </w:r>
+      <w:r>
+        <w:rPr>
+          <w:rStyle w:val="Strong"/>
+          <w:rFonts w:ascii="Times New Roman" w:hAnsi="Times New Roman" w:cs="Times New Roman"/>
+          <w:sz w:val="26"/>
+          <w:szCs w:val="26"/>
+        </w:rPr>
+        <w:t>live systems</w:t>
+      </w:r>
+      <w:r>
+        <w:rPr>
+          <w:rFonts w:ascii="Times New Roman" w:hAnsi="Times New Roman" w:cs="Times New Roman"/>
+          <w:sz w:val="26"/>
+          <w:szCs w:val="26"/>
+        </w:rPr>
+        <w:t>, debugging complex issues, and optimizing existing codebases.</w:t>
+      </w:r>
+      <w:r>
+        <w:rPr>
+          <w:rFonts w:ascii="Times New Roman" w:hAnsi="Times New Roman" w:cs="Times New Roman"/>
+          <w:sz w:val="26"/>
+          <w:szCs w:val="26"/>
+        </w:rPr>
+        <w:br/>
+        <w:t xml:space="preserve">I’m also good at translating </w:t>
+      </w:r>
+      <w:r>
+        <w:rPr>
+          <w:rStyle w:val="Strong"/>
+          <w:rFonts w:ascii="Times New Roman" w:hAnsi="Times New Roman" w:cs="Times New Roman"/>
+          <w:sz w:val="26"/>
+          <w:szCs w:val="26"/>
+        </w:rPr>
+        <w:t>business requirements into clean, maintainable technical solutions</w:t>
+      </w:r>
+      <w:r>
+        <w:rPr>
+          <w:rFonts w:ascii="Times New Roman" w:hAnsi="Times New Roman" w:cs="Times New Roman"/>
+          <w:sz w:val="26"/>
+          <w:szCs w:val="26"/>
+        </w:rPr>
+        <w:t>, and I actively contribute during design and code reviews as a team player</w:t>
       </w:r>
     </w:p>
     <w:p>
@@ -1984,25 +1792,172 @@
           <w:sz w:val="32"/>
           <w:szCs w:val="32"/>
         </w:rPr>
-        <w:t>How many years of experience do you have?</w:t>
-      </w:r>
-    </w:p>
-    <w:p>
-      <w:pPr>
-        <w:pStyle w:val="ListParagraph"/>
-        <w:rPr>
-          <w:rFonts w:ascii="Times New Roman" w:hAnsi="Times New Roman" w:cs="Times New Roman"/>
-          <w:sz w:val="24"/>
-          <w:szCs w:val="24"/>
-        </w:rPr>
-      </w:pPr>
-      <w:r>
-        <w:rPr>
-          <w:rFonts w:ascii="Times New Roman" w:hAnsi="Times New Roman" w:cs="Times New Roman"/>
-          <w:sz w:val="24"/>
-          <w:szCs w:val="24"/>
-        </w:rPr>
-        <w:t>I have 5 years of professional experience as a web developer, working extensively on the frontend and on backend CMS solutions such as WordPress, Directus, and Netlify CMS. Over the last 2+ years, I’ve also been building backend systems using Node.js, NestJS, and GraphQL.</w:t>
+        <w:t>What are your weaknesses?</w:t>
+      </w:r>
+    </w:p>
+    <w:p>
+      <w:pPr>
+        <w:pStyle w:val="ListParagraph"/>
+        <w:rPr>
+          <w:rFonts w:ascii="Times New Roman" w:hAnsi="Times New Roman" w:cs="Times New Roman"/>
+          <w:b/>
+          <w:sz w:val="26"/>
+          <w:szCs w:val="26"/>
+          <w:lang w:val="en-US"/>
+        </w:rPr>
+      </w:pPr>
+      <w:r>
+        <w:rPr>
+          <w:rFonts w:ascii="Times New Roman" w:hAnsi="Times New Roman" w:cs="Times New Roman"/>
+          <w:b/>
+          <w:sz w:val="26"/>
+          <w:szCs w:val="26"/>
+        </w:rPr>
+        <w:t>HR Round</w:t>
+      </w:r>
+    </w:p>
+    <w:p>
+      <w:pPr>
+        <w:pStyle w:val="ListParagraph"/>
+        <w:rPr>
+          <w:rFonts w:ascii="Times New Roman" w:hAnsi="Times New Roman" w:cs="Times New Roman"/>
+          <w:sz w:val="26"/>
+          <w:szCs w:val="26"/>
+        </w:rPr>
+      </w:pPr>
+      <w:r>
+        <w:rPr>
+          <w:rFonts w:ascii="Times New Roman" w:hAnsi="Times New Roman" w:cs="Times New Roman"/>
+          <w:sz w:val="26"/>
+          <w:szCs w:val="26"/>
+        </w:rPr>
+        <w:t>Earlier, I used to spend extra time perfecting every piece of code, which sometimes affected timelines.</w:t>
+      </w:r>
+      <w:r>
+        <w:rPr>
+          <w:rFonts w:ascii="Times New Roman" w:hAnsi="Times New Roman" w:cs="Times New Roman"/>
+          <w:sz w:val="26"/>
+          <w:szCs w:val="26"/>
+        </w:rPr>
+        <w:br/>
+        <w:t xml:space="preserve">Over time, I’ve learned to </w:t>
+      </w:r>
+      <w:r>
+        <w:rPr>
+          <w:rStyle w:val="Strong"/>
+          <w:rFonts w:ascii="Times New Roman" w:hAnsi="Times New Roman" w:cs="Times New Roman"/>
+          <w:sz w:val="26"/>
+          <w:szCs w:val="26"/>
+        </w:rPr>
+        <w:t>balance quality with efficiency</w:t>
+      </w:r>
+      <w:r>
+        <w:rPr>
+          <w:rFonts w:ascii="Times New Roman" w:hAnsi="Times New Roman" w:cs="Times New Roman"/>
+          <w:sz w:val="26"/>
+          <w:szCs w:val="26"/>
+        </w:rPr>
+        <w:t xml:space="preserve">. Now I focus on delivering solutions that are both </w:t>
+      </w:r>
+      <w:r>
+        <w:rPr>
+          <w:rStyle w:val="Strong"/>
+          <w:rFonts w:ascii="Times New Roman" w:hAnsi="Times New Roman" w:cs="Times New Roman"/>
+          <w:sz w:val="26"/>
+          <w:szCs w:val="26"/>
+        </w:rPr>
+        <w:t>clean and scalable</w:t>
+      </w:r>
+      <w:r>
+        <w:rPr>
+          <w:rFonts w:ascii="Times New Roman" w:hAnsi="Times New Roman" w:cs="Times New Roman"/>
+          <w:sz w:val="26"/>
+          <w:szCs w:val="26"/>
+        </w:rPr>
+        <w:t>, while meeting project deadlines</w:t>
+      </w:r>
+    </w:p>
+    <w:p>
+      <w:pPr>
+        <w:pStyle w:val="ListParagraph"/>
+        <w:rPr>
+          <w:rFonts w:ascii="Times New Roman" w:hAnsi="Times New Roman" w:cs="Times New Roman"/>
+          <w:sz w:val="26"/>
+          <w:szCs w:val="26"/>
+        </w:rPr>
+      </w:pPr>
+    </w:p>
+    <w:p>
+      <w:pPr>
+        <w:pStyle w:val="ListParagraph"/>
+        <w:rPr>
+          <w:rFonts w:ascii="Times New Roman" w:hAnsi="Times New Roman" w:cs="Times New Roman"/>
+          <w:b/>
+          <w:sz w:val="26"/>
+          <w:szCs w:val="26"/>
+        </w:rPr>
+      </w:pPr>
+      <w:r>
+        <w:rPr>
+          <w:rFonts w:ascii="Times New Roman" w:hAnsi="Times New Roman" w:cs="Times New Roman"/>
+          <w:b/>
+          <w:sz w:val="26"/>
+          <w:szCs w:val="26"/>
+        </w:rPr>
+        <w:t>Technical Round</w:t>
+      </w:r>
+    </w:p>
+    <w:p>
+      <w:pPr>
+        <w:pStyle w:val="ListParagraph"/>
+        <w:rPr>
+          <w:rFonts w:ascii="Times New Roman" w:hAnsi="Times New Roman" w:cs="Times New Roman"/>
+          <w:sz w:val="26"/>
+          <w:szCs w:val="26"/>
+        </w:rPr>
+      </w:pPr>
+      <w:r>
+        <w:rPr>
+          <w:rFonts w:ascii="Times New Roman" w:hAnsi="Times New Roman" w:cs="Times New Roman"/>
+          <w:sz w:val="26"/>
+          <w:szCs w:val="26"/>
+        </w:rPr>
+        <w:t>In the past, I tended to spend too much time optimizing or refining code, which sometimes slowed down delivery.</w:t>
+      </w:r>
+      <w:r>
+        <w:rPr>
+          <w:rFonts w:ascii="Times New Roman" w:hAnsi="Times New Roman" w:cs="Times New Roman"/>
+          <w:sz w:val="26"/>
+          <w:szCs w:val="26"/>
+        </w:rPr>
+        <w:br/>
+        <w:t xml:space="preserve">I’ve improved by </w:t>
+      </w:r>
+      <w:r>
+        <w:rPr>
+          <w:rStyle w:val="Strong"/>
+          <w:rFonts w:ascii="Times New Roman" w:hAnsi="Times New Roman" w:cs="Times New Roman"/>
+          <w:sz w:val="26"/>
+          <w:szCs w:val="26"/>
+        </w:rPr>
+        <w:t>prioritizing critical areas for optimization</w:t>
+      </w:r>
+      <w:r>
+        <w:rPr>
+          <w:rFonts w:ascii="Times New Roman" w:hAnsi="Times New Roman" w:cs="Times New Roman"/>
+          <w:sz w:val="26"/>
+          <w:szCs w:val="26"/>
+        </w:rPr>
+        <w:t xml:space="preserve"> and adopting best practices for clean, maintainable code.</w:t>
+      </w:r>
+      <w:r>
+        <w:rPr>
+          <w:rFonts w:ascii="Times New Roman" w:hAnsi="Times New Roman" w:cs="Times New Roman"/>
+          <w:sz w:val="26"/>
+          <w:szCs w:val="26"/>
+        </w:rPr>
+        <w:br/>
+        <w:t>This way, I ensure high-quality solutions without compromising timelines</w:t>
       </w:r>
     </w:p>
     <w:p>
@@ -2038,7 +1993,7 @@
           <w:sz w:val="32"/>
           <w:szCs w:val="32"/>
         </w:rPr>
-        <w:t>What is your current role/responsibility?</w:t>
+        <w:t>Where do you see yourself in 3–5 years?</w:t>
       </w:r>
     </w:p>
     <w:p>
@@ -2066,36 +2021,35 @@
       <w:pPr>
         <w:pStyle w:val="ListParagraph"/>
         <w:rPr>
-          <w:rStyle w:val="Strong"/>
-          <w:rFonts w:ascii="Times New Roman" w:hAnsi="Times New Roman" w:cs="Times New Roman"/>
-          <w:sz w:val="26"/>
-          <w:szCs w:val="26"/>
-        </w:rPr>
-      </w:pPr>
-      <w:r>
-        <w:rPr>
-          <w:rFonts w:ascii="Times New Roman" w:hAnsi="Times New Roman" w:cs="Times New Roman"/>
-          <w:sz w:val="26"/>
-          <w:szCs w:val="26"/>
-        </w:rPr>
-        <w:t xml:space="preserve">I currently work as a </w:t>
-      </w:r>
-      <w:r>
-        <w:rPr>
-          <w:rStyle w:val="Strong"/>
-          <w:rFonts w:ascii="Times New Roman" w:hAnsi="Times New Roman" w:cs="Times New Roman"/>
-          <w:sz w:val="26"/>
-          <w:szCs w:val="26"/>
-        </w:rPr>
-        <w:t>Senior Software Engineer</w:t>
-      </w:r>
-      <w:r>
-        <w:rPr>
-          <w:rFonts w:ascii="Times New Roman" w:hAnsi="Times New Roman" w:cs="Times New Roman"/>
-          <w:sz w:val="26"/>
-          <w:szCs w:val="26"/>
-        </w:rPr>
-        <w:t>, responsible for building and maintaining web applications end-to-end.</w:t>
+          <w:rFonts w:ascii="Times New Roman" w:hAnsi="Times New Roman" w:cs="Times New Roman"/>
+          <w:sz w:val="26"/>
+          <w:szCs w:val="26"/>
+        </w:rPr>
+      </w:pPr>
+      <w:r>
+        <w:rPr>
+          <w:rFonts w:ascii="Times New Roman" w:hAnsi="Times New Roman" w:cs="Times New Roman"/>
+          <w:sz w:val="26"/>
+          <w:szCs w:val="26"/>
+        </w:rPr>
+        <w:t xml:space="preserve">In the next 3–5 years, I see myself in a </w:t>
+      </w:r>
+      <w:r>
+        <w:rPr>
+          <w:rStyle w:val="Strong"/>
+          <w:rFonts w:ascii="Times New Roman" w:hAnsi="Times New Roman" w:cs="Times New Roman"/>
+          <w:sz w:val="26"/>
+          <w:szCs w:val="26"/>
+        </w:rPr>
+        <w:t>leadership role</w:t>
+      </w:r>
+      <w:r>
+        <w:rPr>
+          <w:rFonts w:ascii="Times New Roman" w:hAnsi="Times New Roman" w:cs="Times New Roman"/>
+          <w:sz w:val="26"/>
+          <w:szCs w:val="26"/>
+        </w:rPr>
+        <w:t>, such as a Lead Engineer or Solution Architect.</w:t>
       </w:r>
       <w:r>
         <w:rPr>
@@ -2104,204 +2058,230 @@
           <w:szCs w:val="26"/>
         </w:rPr>
         <w:br/>
-        <w:t xml:space="preserve">I collaborate closely with </w:t>
-      </w:r>
-      <w:r>
-        <w:rPr>
-          <w:rStyle w:val="Strong"/>
-          <w:rFonts w:ascii="Times New Roman" w:hAnsi="Times New Roman" w:cs="Times New Roman"/>
-          <w:sz w:val="26"/>
-          <w:szCs w:val="26"/>
-        </w:rPr>
-        <w:t>product, QA, and other stakeholders</w:t>
-      </w:r>
-      <w:r>
-        <w:rPr>
-          <w:rFonts w:ascii="Times New Roman" w:hAnsi="Times New Roman" w:cs="Times New Roman"/>
-          <w:sz w:val="26"/>
-          <w:szCs w:val="26"/>
-        </w:rPr>
-        <w:t xml:space="preserve">, handle </w:t>
-      </w:r>
-      <w:r>
-        <w:rPr>
-          <w:rFonts w:ascii="Times New Roman" w:hAnsi="Times New Roman" w:cs="Times New Roman"/>
-          <w:sz w:val="26"/>
-          <w:szCs w:val="26"/>
-        </w:rPr>
-        <w:lastRenderedPageBreak/>
-        <w:t xml:space="preserve">integrations like payment systems, and actively participate in </w:t>
-      </w:r>
-      <w:r>
-        <w:rPr>
-          <w:rStyle w:val="Strong"/>
-          <w:rFonts w:ascii="Times New Roman" w:hAnsi="Times New Roman" w:cs="Times New Roman"/>
-          <w:sz w:val="26"/>
-          <w:szCs w:val="26"/>
-        </w:rPr>
-        <w:t>feature planning, code reviews, and team discussions</w:t>
-      </w:r>
-    </w:p>
-    <w:p>
-      <w:pPr>
-        <w:pStyle w:val="ListParagraph"/>
-        <w:rPr>
-          <w:rFonts w:ascii="Times New Roman" w:hAnsi="Times New Roman" w:cs="Times New Roman"/>
-          <w:b/>
+        <w:t xml:space="preserve">I aim to </w:t>
+      </w:r>
+      <w:r>
+        <w:rPr>
+          <w:rStyle w:val="Strong"/>
+          <w:rFonts w:ascii="Times New Roman" w:hAnsi="Times New Roman" w:cs="Times New Roman"/>
+          <w:sz w:val="26"/>
+          <w:szCs w:val="26"/>
+        </w:rPr>
+        <w:t>mentor junior team members, drive project success</w:t>
+      </w:r>
+      <w:r>
+        <w:rPr>
+          <w:rFonts w:ascii="Times New Roman" w:hAnsi="Times New Roman" w:cs="Times New Roman"/>
+          <w:sz w:val="26"/>
+          <w:szCs w:val="26"/>
+        </w:rPr>
+        <w:t xml:space="preserve">, and contribute to </w:t>
+      </w:r>
+      <w:r>
+        <w:rPr>
+          <w:rStyle w:val="Strong"/>
+          <w:rFonts w:ascii="Times New Roman" w:hAnsi="Times New Roman" w:cs="Times New Roman"/>
+          <w:sz w:val="26"/>
+          <w:szCs w:val="26"/>
+        </w:rPr>
+        <w:t>building scalable products that deliver real value to users</w:t>
+      </w:r>
+      <w:r>
+        <w:rPr>
+          <w:rFonts w:ascii="Times New Roman" w:hAnsi="Times New Roman" w:cs="Times New Roman"/>
+          <w:sz w:val="26"/>
+          <w:szCs w:val="26"/>
+        </w:rPr>
+        <w:t>.</w:t>
+      </w:r>
+      <w:r>
+        <w:rPr>
+          <w:rFonts w:ascii="Times New Roman" w:hAnsi="Times New Roman" w:cs="Times New Roman"/>
+          <w:sz w:val="26"/>
+          <w:szCs w:val="26"/>
+        </w:rPr>
+        <w:br/>
+        <w:t xml:space="preserve">I’m looking for opportunities where I can </w:t>
+      </w:r>
+      <w:r>
+        <w:rPr>
+          <w:rStyle w:val="Strong"/>
+          <w:rFonts w:ascii="Times New Roman" w:hAnsi="Times New Roman" w:cs="Times New Roman"/>
+          <w:sz w:val="26"/>
+          <w:szCs w:val="26"/>
+        </w:rPr>
+        <w:t>grow technically and take on more responsibilities</w:t>
+      </w:r>
+      <w:r>
+        <w:rPr>
+          <w:rFonts w:ascii="Times New Roman" w:hAnsi="Times New Roman" w:cs="Times New Roman"/>
+          <w:sz w:val="26"/>
+          <w:szCs w:val="26"/>
+        </w:rPr>
+        <w:t>, while collaborating with talented teams</w:t>
+      </w:r>
+    </w:p>
+    <w:p>
+      <w:pPr>
+        <w:pStyle w:val="ListParagraph"/>
+        <w:rPr>
+          <w:rFonts w:ascii="Times New Roman" w:hAnsi="Times New Roman" w:cs="Times New Roman"/>
+          <w:sz w:val="26"/>
+          <w:szCs w:val="26"/>
+        </w:rPr>
+      </w:pPr>
+    </w:p>
+    <w:p>
+      <w:pPr>
+        <w:pStyle w:val="ListParagraph"/>
+        <w:rPr>
+          <w:rFonts w:ascii="Times New Roman" w:hAnsi="Times New Roman" w:cs="Times New Roman"/>
+          <w:b/>
+          <w:sz w:val="26"/>
+          <w:szCs w:val="26"/>
+        </w:rPr>
+      </w:pPr>
+      <w:r>
+        <w:rPr>
+          <w:rFonts w:ascii="Times New Roman" w:hAnsi="Times New Roman" w:cs="Times New Roman"/>
+          <w:b/>
+          <w:sz w:val="26"/>
+          <w:szCs w:val="26"/>
+        </w:rPr>
+        <w:t>Technical Round</w:t>
+      </w:r>
+    </w:p>
+    <w:p>
+      <w:pPr>
+        <w:pStyle w:val="ListParagraph"/>
+        <w:rPr>
+          <w:rFonts w:ascii="Times New Roman" w:hAnsi="Times New Roman" w:cs="Times New Roman"/>
+          <w:sz w:val="26"/>
+          <w:szCs w:val="26"/>
+        </w:rPr>
+      </w:pPr>
+      <w:r>
+        <w:rPr>
+          <w:rFonts w:ascii="Times New Roman" w:hAnsi="Times New Roman" w:cs="Times New Roman"/>
+          <w:sz w:val="26"/>
+          <w:szCs w:val="26"/>
+        </w:rPr>
+        <w:t xml:space="preserve">In 3–5 years, I envision myself as a </w:t>
+      </w:r>
+      <w:r>
+        <w:rPr>
+          <w:rStyle w:val="Strong"/>
+          <w:rFonts w:ascii="Times New Roman" w:hAnsi="Times New Roman" w:cs="Times New Roman"/>
+          <w:sz w:val="26"/>
+          <w:szCs w:val="26"/>
+        </w:rPr>
+        <w:t>Lead Engineer or Solution Architect</w:t>
+      </w:r>
+      <w:r>
+        <w:rPr>
+          <w:rFonts w:ascii="Times New Roman" w:hAnsi="Times New Roman" w:cs="Times New Roman"/>
+          <w:sz w:val="26"/>
+          <w:szCs w:val="26"/>
+        </w:rPr>
+        <w:t xml:space="preserve">, taking ownership of </w:t>
+      </w:r>
+      <w:r>
+        <w:rPr>
+          <w:rStyle w:val="Strong"/>
+          <w:rFonts w:ascii="Times New Roman" w:hAnsi="Times New Roman" w:cs="Times New Roman"/>
+          <w:sz w:val="26"/>
+          <w:szCs w:val="26"/>
+        </w:rPr>
+        <w:t>system design and architecture decisions</w:t>
+      </w:r>
+      <w:r>
+        <w:rPr>
+          <w:rFonts w:ascii="Times New Roman" w:hAnsi="Times New Roman" w:cs="Times New Roman"/>
+          <w:sz w:val="26"/>
+          <w:szCs w:val="26"/>
+        </w:rPr>
+        <w:t>.</w:t>
+      </w:r>
+      <w:r>
+        <w:rPr>
+          <w:rFonts w:ascii="Times New Roman" w:hAnsi="Times New Roman" w:cs="Times New Roman"/>
+          <w:sz w:val="26"/>
+          <w:szCs w:val="26"/>
+        </w:rPr>
+        <w:br/>
+        <w:t xml:space="preserve">I want to </w:t>
+      </w:r>
+      <w:r>
+        <w:rPr>
+          <w:rStyle w:val="Strong"/>
+          <w:rFonts w:ascii="Times New Roman" w:hAnsi="Times New Roman" w:cs="Times New Roman"/>
+          <w:sz w:val="26"/>
+          <w:szCs w:val="26"/>
+        </w:rPr>
+        <w:t>mentor juniors, review code for quality and scalability</w:t>
+      </w:r>
+      <w:r>
+        <w:rPr>
+          <w:rFonts w:ascii="Times New Roman" w:hAnsi="Times New Roman" w:cs="Times New Roman"/>
+          <w:sz w:val="26"/>
+          <w:szCs w:val="26"/>
+        </w:rPr>
+        <w:t xml:space="preserve">, and contribute to </w:t>
+      </w:r>
+      <w:r>
+        <w:rPr>
+          <w:rStyle w:val="Strong"/>
+          <w:rFonts w:ascii="Times New Roman" w:hAnsi="Times New Roman" w:cs="Times New Roman"/>
+          <w:sz w:val="26"/>
+          <w:szCs w:val="26"/>
+        </w:rPr>
+        <w:t>building robust, high-performance systems</w:t>
+      </w:r>
+      <w:r>
+        <w:rPr>
+          <w:rFonts w:ascii="Times New Roman" w:hAnsi="Times New Roman" w:cs="Times New Roman"/>
+          <w:sz w:val="26"/>
+          <w:szCs w:val="26"/>
+        </w:rPr>
+        <w:t xml:space="preserve"> that can scale efficiently.</w:t>
+      </w:r>
+      <w:r>
+        <w:rPr>
+          <w:rFonts w:ascii="Times New Roman" w:hAnsi="Times New Roman" w:cs="Times New Roman"/>
+          <w:sz w:val="26"/>
+          <w:szCs w:val="26"/>
+        </w:rPr>
+        <w:br/>
+        <w:t xml:space="preserve">My goal is to combine </w:t>
+      </w:r>
+      <w:r>
+        <w:rPr>
+          <w:rStyle w:val="Strong"/>
+          <w:rFonts w:ascii="Times New Roman" w:hAnsi="Times New Roman" w:cs="Times New Roman"/>
+          <w:sz w:val="26"/>
+          <w:szCs w:val="26"/>
+        </w:rPr>
+        <w:t>hands-on development with architectural responsibilities</w:t>
+      </w:r>
+      <w:r>
+        <w:rPr>
+          <w:rFonts w:ascii="Times New Roman" w:hAnsi="Times New Roman" w:cs="Times New Roman"/>
+          <w:sz w:val="26"/>
+          <w:szCs w:val="26"/>
+        </w:rPr>
+        <w:t xml:space="preserve"> to solve complex technical challenges</w:t>
+      </w:r>
+    </w:p>
+    <w:p>
+      <w:pPr>
+        <w:pStyle w:val="ListParagraph"/>
+        <w:rPr>
+          <w:rFonts w:ascii="Times New Roman" w:hAnsi="Times New Roman" w:cs="Times New Roman"/>
           <w:sz w:val="26"/>
           <w:szCs w:val="26"/>
           <w:lang w:val="en-US"/>
         </w:rPr>
       </w:pPr>
-    </w:p>
-    <w:p>
-      <w:pPr>
-        <w:pStyle w:val="ListParagraph"/>
-        <w:rPr>
-          <w:rFonts w:ascii="Times New Roman" w:hAnsi="Times New Roman" w:cs="Times New Roman"/>
-          <w:b/>
-          <w:sz w:val="26"/>
-          <w:szCs w:val="26"/>
-        </w:rPr>
-      </w:pPr>
-      <w:r>
-        <w:rPr>
-          <w:rFonts w:ascii="Times New Roman" w:hAnsi="Times New Roman" w:cs="Times New Roman"/>
-          <w:b/>
-          <w:sz w:val="26"/>
-          <w:szCs w:val="26"/>
-        </w:rPr>
-        <w:t>Technical Round</w:t>
-      </w:r>
-    </w:p>
-    <w:p>
-      <w:pPr>
-        <w:pStyle w:val="ListParagraph"/>
-        <w:rPr>
-          <w:rFonts w:ascii="Times New Roman" w:hAnsi="Times New Roman" w:cs="Times New Roman"/>
-          <w:sz w:val="26"/>
-          <w:szCs w:val="26"/>
-        </w:rPr>
-      </w:pPr>
-      <w:r>
-        <w:rPr>
-          <w:rFonts w:ascii="Times New Roman" w:hAnsi="Times New Roman" w:cs="Times New Roman"/>
-          <w:sz w:val="26"/>
-          <w:szCs w:val="26"/>
-        </w:rPr>
-        <w:t xml:space="preserve">I work on </w:t>
-      </w:r>
-      <w:r>
-        <w:rPr>
-          <w:rStyle w:val="Strong"/>
-          <w:rFonts w:ascii="Times New Roman" w:hAnsi="Times New Roman" w:cs="Times New Roman"/>
-          <w:sz w:val="26"/>
-          <w:szCs w:val="26"/>
-        </w:rPr>
-        <w:t>frontend development using React and Next.js</w:t>
-      </w:r>
-      <w:r>
-        <w:rPr>
-          <w:rFonts w:ascii="Times New Roman" w:hAnsi="Times New Roman" w:cs="Times New Roman"/>
-          <w:sz w:val="26"/>
-          <w:szCs w:val="26"/>
-        </w:rPr>
-        <w:t xml:space="preserve"> and contribute to </w:t>
-      </w:r>
-      <w:r>
-        <w:rPr>
-          <w:rStyle w:val="Strong"/>
-          <w:rFonts w:ascii="Times New Roman" w:hAnsi="Times New Roman" w:cs="Times New Roman"/>
-          <w:sz w:val="26"/>
-          <w:szCs w:val="26"/>
-        </w:rPr>
-        <w:t>backend API development</w:t>
-      </w:r>
-      <w:r>
-        <w:rPr>
-          <w:rFonts w:ascii="Times New Roman" w:hAnsi="Times New Roman" w:cs="Times New Roman"/>
-          <w:sz w:val="26"/>
-          <w:szCs w:val="26"/>
-        </w:rPr>
-        <w:t>.</w:t>
-      </w:r>
-      <w:r>
-        <w:rPr>
-          <w:rFonts w:ascii="Times New Roman" w:hAnsi="Times New Roman" w:cs="Times New Roman"/>
-          <w:sz w:val="26"/>
-          <w:szCs w:val="26"/>
-        </w:rPr>
-        <w:br/>
-        <w:t xml:space="preserve">I’ve handled </w:t>
-      </w:r>
-      <w:r>
-        <w:rPr>
-          <w:rStyle w:val="Strong"/>
-          <w:rFonts w:ascii="Times New Roman" w:hAnsi="Times New Roman" w:cs="Times New Roman"/>
-          <w:sz w:val="26"/>
-          <w:szCs w:val="26"/>
-        </w:rPr>
-        <w:t>complex integrations like payment gateways</w:t>
-      </w:r>
-      <w:r>
-        <w:rPr>
-          <w:rFonts w:ascii="Times New Roman" w:hAnsi="Times New Roman" w:cs="Times New Roman"/>
-          <w:sz w:val="26"/>
-          <w:szCs w:val="26"/>
-        </w:rPr>
-        <w:t xml:space="preserve">, optimized existing systems for performance, and ensured </w:t>
-      </w:r>
-      <w:r>
-        <w:rPr>
-          <w:rStyle w:val="Strong"/>
-          <w:rFonts w:ascii="Times New Roman" w:hAnsi="Times New Roman" w:cs="Times New Roman"/>
-          <w:sz w:val="26"/>
-          <w:szCs w:val="26"/>
-        </w:rPr>
-        <w:t>scalable, maintainable code</w:t>
-      </w:r>
-      <w:r>
-        <w:rPr>
-          <w:rFonts w:ascii="Times New Roman" w:hAnsi="Times New Roman" w:cs="Times New Roman"/>
-          <w:sz w:val="26"/>
-          <w:szCs w:val="26"/>
-        </w:rPr>
-        <w:t>.</w:t>
-      </w:r>
-      <w:r>
-        <w:rPr>
-          <w:rFonts w:ascii="Times New Roman" w:hAnsi="Times New Roman" w:cs="Times New Roman"/>
-          <w:sz w:val="26"/>
-          <w:szCs w:val="26"/>
-        </w:rPr>
-        <w:br/>
-        <w:t xml:space="preserve">I also participate in </w:t>
-      </w:r>
-      <w:r>
-        <w:rPr>
-          <w:rStyle w:val="Strong"/>
-          <w:rFonts w:ascii="Times New Roman" w:hAnsi="Times New Roman" w:cs="Times New Roman"/>
-          <w:sz w:val="26"/>
-          <w:szCs w:val="26"/>
-        </w:rPr>
-        <w:t>feature planning, code reviews</w:t>
-      </w:r>
-      <w:r>
-        <w:rPr>
-          <w:rFonts w:ascii="Times New Roman" w:hAnsi="Times New Roman" w:cs="Times New Roman"/>
-          <w:sz w:val="26"/>
-          <w:szCs w:val="26"/>
-        </w:rPr>
-        <w:t>, and architectural discussions</w:t>
-      </w:r>
-      <w:r>
-        <w:rPr>
-          <w:rFonts w:ascii="Times New Roman" w:hAnsi="Times New Roman" w:cs="Times New Roman"/>
-          <w:sz w:val="26"/>
-          <w:szCs w:val="26"/>
-        </w:rPr>
-        <w:br/>
-      </w:r>
     </w:p>
     <w:p>
       <w:pPr>
@@ -2325,72 +2305,207 @@
           <w:sz w:val="32"/>
           <w:szCs w:val="32"/>
         </w:rPr>
-        <w:t>What is your notice period?</w:t>
-      </w:r>
-    </w:p>
-    <w:p>
-      <w:pPr>
-        <w:pStyle w:val="ListParagraph"/>
-        <w:rPr>
-          <w:rStyle w:val="Strong"/>
-          <w:rFonts w:ascii="Times New Roman" w:hAnsi="Times New Roman" w:cs="Times New Roman"/>
-          <w:sz w:val="26"/>
-          <w:szCs w:val="26"/>
-        </w:rPr>
-      </w:pPr>
-      <w:r>
-        <w:rPr>
-          <w:rFonts w:ascii="Times New Roman" w:hAnsi="Times New Roman" w:cs="Times New Roman"/>
-          <w:sz w:val="26"/>
-          <w:szCs w:val="26"/>
-        </w:rPr>
-        <w:t xml:space="preserve">My notice period is </w:t>
-      </w:r>
-      <w:r>
-        <w:rPr>
-          <w:rStyle w:val="Strong"/>
-          <w:rFonts w:ascii="Times New Roman" w:hAnsi="Times New Roman" w:cs="Times New Roman"/>
-          <w:sz w:val="26"/>
-          <w:szCs w:val="26"/>
-        </w:rPr>
-        <w:t>60 days</w:t>
-      </w:r>
-      <w:r>
-        <w:rPr>
-          <w:rFonts w:ascii="Times New Roman" w:hAnsi="Times New Roman" w:cs="Times New Roman"/>
-          <w:sz w:val="26"/>
-          <w:szCs w:val="26"/>
-        </w:rPr>
-        <w:t xml:space="preserve">. </w:t>
-      </w:r>
-      <w:r>
-        <w:rPr>
-          <w:rFonts w:ascii="Times New Roman" w:hAnsi="Times New Roman" w:cs="Times New Roman"/>
-          <w:sz w:val="26"/>
-          <w:szCs w:val="26"/>
-        </w:rPr>
-        <w:t xml:space="preserve">However, I can try to negotiate an </w:t>
-      </w:r>
-      <w:r>
-        <w:rPr>
-          <w:rStyle w:val="Strong"/>
-          <w:rFonts w:ascii="Times New Roman" w:hAnsi="Times New Roman" w:cs="Times New Roman"/>
-          <w:sz w:val="26"/>
-          <w:szCs w:val="26"/>
-        </w:rPr>
-        <w:t>early release if required</w:t>
-      </w:r>
-    </w:p>
-    <w:p>
-      <w:pPr>
-        <w:pStyle w:val="ListParagraph"/>
-        <w:rPr>
-          <w:rFonts w:ascii="Times New Roman" w:hAnsi="Times New Roman" w:cs="Times New Roman"/>
+        <w:t>Why should we hire you?</w:t>
+      </w:r>
+    </w:p>
+    <w:p>
+      <w:pPr>
+        <w:pStyle w:val="ListParagraph"/>
+        <w:rPr>
+          <w:rFonts w:ascii="Times New Roman" w:hAnsi="Times New Roman" w:cs="Times New Roman"/>
+          <w:b/>
           <w:sz w:val="26"/>
           <w:szCs w:val="26"/>
           <w:lang w:val="en-US"/>
         </w:rPr>
       </w:pPr>
+      <w:r>
+        <w:rPr>
+          <w:rFonts w:ascii="Times New Roman" w:hAnsi="Times New Roman" w:cs="Times New Roman"/>
+          <w:b/>
+          <w:sz w:val="26"/>
+          <w:szCs w:val="26"/>
+        </w:rPr>
+        <w:t>HR Round</w:t>
+      </w:r>
+    </w:p>
+    <w:p>
+      <w:pPr>
+        <w:pStyle w:val="ListParagraph"/>
+        <w:rPr>
+          <w:rFonts w:ascii="Times New Roman" w:hAnsi="Times New Roman" w:cs="Times New Roman"/>
+          <w:sz w:val="26"/>
+          <w:szCs w:val="26"/>
+        </w:rPr>
+      </w:pPr>
+      <w:r>
+        <w:rPr>
+          <w:rFonts w:ascii="Times New Roman" w:hAnsi="Times New Roman" w:cs="Times New Roman"/>
+          <w:sz w:val="26"/>
+          <w:szCs w:val="26"/>
+        </w:rPr>
+        <w:lastRenderedPageBreak/>
+        <w:t xml:space="preserve">You should hire me because I bring </w:t>
+      </w:r>
+      <w:r>
+        <w:rPr>
+          <w:rStyle w:val="Strong"/>
+          <w:rFonts w:ascii="Times New Roman" w:hAnsi="Times New Roman" w:cs="Times New Roman"/>
+          <w:sz w:val="26"/>
+          <w:szCs w:val="26"/>
+        </w:rPr>
+        <w:t>hands-on experience with production-level applications</w:t>
+      </w:r>
+      <w:r>
+        <w:rPr>
+          <w:rFonts w:ascii="Times New Roman" w:hAnsi="Times New Roman" w:cs="Times New Roman"/>
+          <w:sz w:val="26"/>
+          <w:szCs w:val="26"/>
+        </w:rPr>
+        <w:t>, strong frontend expertise, and a solid understanding of backend systems.</w:t>
+      </w:r>
+      <w:r>
+        <w:rPr>
+          <w:rFonts w:ascii="Times New Roman" w:hAnsi="Times New Roman" w:cs="Times New Roman"/>
+          <w:sz w:val="26"/>
+          <w:szCs w:val="26"/>
+        </w:rPr>
+        <w:br/>
+        <w:t xml:space="preserve">I can </w:t>
+      </w:r>
+      <w:r>
+        <w:rPr>
+          <w:rStyle w:val="Strong"/>
+          <w:rFonts w:ascii="Times New Roman" w:hAnsi="Times New Roman" w:cs="Times New Roman"/>
+          <w:sz w:val="26"/>
+          <w:szCs w:val="26"/>
+        </w:rPr>
+        <w:t>take ownership of features end-to-end</w:t>
+      </w:r>
+      <w:r>
+        <w:rPr>
+          <w:rFonts w:ascii="Times New Roman" w:hAnsi="Times New Roman" w:cs="Times New Roman"/>
+          <w:sz w:val="26"/>
+          <w:szCs w:val="26"/>
+        </w:rPr>
+        <w:t>, adapt quickly to new challenges, and contribute effectively from day one while growing with the organization</w:t>
+      </w:r>
+      <w:r>
+        <w:rPr>
+          <w:rFonts w:ascii="Times New Roman" w:hAnsi="Times New Roman" w:cs="Times New Roman"/>
+          <w:sz w:val="26"/>
+          <w:szCs w:val="26"/>
+        </w:rPr>
+        <w:t xml:space="preserve"> </w:t>
+      </w:r>
+    </w:p>
+    <w:p>
+      <w:pPr>
+        <w:pStyle w:val="ListParagraph"/>
+        <w:rPr>
+          <w:rFonts w:ascii="Times New Roman" w:hAnsi="Times New Roman" w:cs="Times New Roman"/>
+          <w:sz w:val="26"/>
+          <w:szCs w:val="26"/>
+        </w:rPr>
+      </w:pPr>
+    </w:p>
+    <w:p>
+      <w:pPr>
+        <w:pStyle w:val="ListParagraph"/>
+        <w:rPr>
+          <w:rFonts w:ascii="Times New Roman" w:hAnsi="Times New Roman" w:cs="Times New Roman"/>
+          <w:b/>
+          <w:sz w:val="26"/>
+          <w:szCs w:val="26"/>
+        </w:rPr>
+      </w:pPr>
+      <w:r>
+        <w:rPr>
+          <w:rFonts w:ascii="Times New Roman" w:hAnsi="Times New Roman" w:cs="Times New Roman"/>
+          <w:b/>
+          <w:sz w:val="26"/>
+          <w:szCs w:val="26"/>
+        </w:rPr>
+        <w:t>Technical Round</w:t>
+      </w:r>
+    </w:p>
+    <w:p>
+      <w:pPr>
+        <w:pStyle w:val="ListParagraph"/>
+        <w:rPr>
+          <w:rFonts w:ascii="Times New Roman" w:hAnsi="Times New Roman" w:cs="Times New Roman"/>
+          <w:sz w:val="26"/>
+          <w:szCs w:val="26"/>
+        </w:rPr>
+      </w:pPr>
+      <w:r>
+        <w:rPr>
+          <w:rFonts w:ascii="Times New Roman" w:hAnsi="Times New Roman" w:cs="Times New Roman"/>
+          <w:sz w:val="26"/>
+          <w:szCs w:val="26"/>
+        </w:rPr>
+        <w:t xml:space="preserve">I bring </w:t>
+      </w:r>
+      <w:r>
+        <w:rPr>
+          <w:rStyle w:val="Strong"/>
+          <w:rFonts w:ascii="Times New Roman" w:hAnsi="Times New Roman" w:cs="Times New Roman"/>
+          <w:sz w:val="26"/>
+          <w:szCs w:val="26"/>
+        </w:rPr>
+        <w:t>4+ years of full-stack development experience</w:t>
+      </w:r>
+      <w:r>
+        <w:rPr>
+          <w:rFonts w:ascii="Times New Roman" w:hAnsi="Times New Roman" w:cs="Times New Roman"/>
+          <w:sz w:val="26"/>
+          <w:szCs w:val="26"/>
+        </w:rPr>
+        <w:t>, with strong skills in React.js, Next.js, and backend API development.</w:t>
+      </w:r>
+      <w:r>
+        <w:rPr>
+          <w:rFonts w:ascii="Times New Roman" w:hAnsi="Times New Roman" w:cs="Times New Roman"/>
+          <w:sz w:val="26"/>
+          <w:szCs w:val="26"/>
+        </w:rPr>
+        <w:br/>
+        <w:t xml:space="preserve">I can </w:t>
+      </w:r>
+      <w:r>
+        <w:rPr>
+          <w:rStyle w:val="Strong"/>
+          <w:rFonts w:ascii="Times New Roman" w:hAnsi="Times New Roman" w:cs="Times New Roman"/>
+          <w:sz w:val="26"/>
+          <w:szCs w:val="26"/>
+        </w:rPr>
+        <w:t>own features end-to-end</w:t>
+      </w:r>
+      <w:r>
+        <w:rPr>
+          <w:rFonts w:ascii="Times New Roman" w:hAnsi="Times New Roman" w:cs="Times New Roman"/>
+          <w:sz w:val="26"/>
+          <w:szCs w:val="26"/>
+        </w:rPr>
+        <w:t xml:space="preserve">, including architecture, implementation, and integration with services like payment systems. I’m comfortable </w:t>
+      </w:r>
+      <w:r>
+        <w:rPr>
+          <w:rStyle w:val="Strong"/>
+          <w:rFonts w:ascii="Times New Roman" w:hAnsi="Times New Roman" w:cs="Times New Roman"/>
+          <w:sz w:val="26"/>
+          <w:szCs w:val="26"/>
+        </w:rPr>
+        <w:t>debugging complex issues, optimizing performance</w:t>
+      </w:r>
+      <w:r>
+        <w:rPr>
+          <w:rFonts w:ascii="Times New Roman" w:hAnsi="Times New Roman" w:cs="Times New Roman"/>
+          <w:sz w:val="26"/>
+          <w:szCs w:val="26"/>
+        </w:rPr>
+        <w:t>, and ensuring scalable, maintainable code</w:t>
+      </w:r>
     </w:p>
     <w:p>
       <w:pPr>
@@ -3524,7 +3639,20 @@
           <w:szCs w:val="26"/>
           <w:lang w:eastAsia="en-IN"/>
         </w:rPr>
-        <w:t>About system design or architecture</w:t>
+        <w:t xml:space="preserve">About </w:t>
+      </w:r>
+      <w:bookmarkStart w:id="0" w:name="_GoBack"/>
+      <w:bookmarkEnd w:id="0"/>
+      <w:r>
+        <w:rPr>
+          <w:rFonts w:ascii="Times New Roman" w:eastAsia="Times New Roman" w:hAnsi="Times New Roman" w:cs="Times New Roman"/>
+          <w:b/>
+          <w:bCs/>
+          <w:sz w:val="26"/>
+          <w:szCs w:val="26"/>
+          <w:lang w:eastAsia="en-IN"/>
+        </w:rPr>
+        <w:t>system design or architecture</w:t>
       </w:r>
     </w:p>
     <w:p>

</xml_diff>